<commit_message>
Explica las clases tarifarias y el orden del esquema en el documento de diseño
Faltaba justificar dos cosas que el modelo da por supuestas: por qué existen
tres clases tarifarias dentro de una misma cabina (son el mismo asiento; lo que
se cobra distinto es la flexibilidad, y `fare_class.rank` ordena esa escalera de
menor a mayor), y por qué las tablas están en ese orden en el esquema (las
claves foráneas lo imponen, pero además va de lo más estable a lo más volátil y
se lee como el flujo del negocio).

Co-Authored-By: Claude Opus 5 <noreply@anthropic.com>
</commit_message>
<xml_diff>
--- a/docs/07-decisiones-de-diseno.docx
+++ b/docs/07-decisiones-de-diseno.docx
@@ -53,7 +53,7 @@
         </w:p>
       </w:sdtContent>
     </w:sdt>
-    <w:bookmarkStart w:id="34" w:name="X1a29119cb0e5f02c141b3cb3c7c5a63bf6df837"/>
+    <w:bookmarkStart w:id="38" w:name="X1a29119cb0e5f02c141b3cb3c7c5a63bf6df837"/>
     <w:p>
       <w:pPr>
         <w:pStyle w:val="Heading1"/>
@@ -5021,7 +5021,7 @@
     </w:p>
     <w:bookmarkEnd w:id="24"/>
     <w:bookmarkEnd w:id="25"/>
-    <w:bookmarkStart w:id="32" w:name="X20e63ea8cf6c867c6c63e075b5876f8e1210011"/>
+    <w:bookmarkStart w:id="36" w:name="X20e63ea8cf6c867c6c63e075b5876f8e1210011"/>
     <w:p>
       <w:pPr>
         <w:pStyle w:val="Heading2"/>
@@ -8336,17 +8336,16 @@
       </w:r>
     </w:p>
     <w:bookmarkEnd w:id="31"/>
-    <w:bookmarkEnd w:id="32"/>
-    <w:bookmarkStart w:id="33" w:name="X909b3bd04e22ae572ac1b194adfed880dcaee6d"/>
-    <w:p>
-      <w:pPr>
-        <w:pStyle w:val="Heading2"/>
-      </w:pPr>
-      <w:r>
-        <w:rPr>
-          <w:lang w:val="es"/>
-        </w:rPr>
-        <w:t xml:space="preserve">6. Resumen: qué se priorizó sobre qué</w:t>
+    <w:bookmarkStart w:id="34" w:name="Xb67c0368caa0a7502a081485bd781e2e0e229b7"/>
+    <w:p>
+      <w:pPr>
+        <w:pStyle w:val="Heading3"/>
+      </w:pPr>
+      <w:r>
+        <w:rPr>
+          <w:lang w:val="es"/>
+        </w:rPr>
+        <w:t xml:space="preserve">5.7 Cabinas y clases tarifarias: qué hay y por qué están ordenadas así</w:t>
       </w:r>
     </w:p>
     <w:p>
@@ -8357,7 +8356,33 @@
         <w:rPr>
           <w:lang w:val="es"/>
         </w:rPr>
-        <w:t xml:space="preserve">Toda arquitectura es un conjunto de renuncias. Estas son las que se tomaron, declaradas:</w:t>
+        <w:t xml:space="preserve">Hay que separar tres conceptos que se confunden con facilidad, porque son</w:t>
+      </w:r>
+      <w:r>
+        <w:rPr>
+          <w:lang w:val="es"/>
+        </w:rPr>
+        <w:t xml:space="preserve"> </w:t>
+      </w:r>
+      <w:r>
+        <w:rPr>
+          <w:b/>
+          <w:bCs/>
+          <w:lang w:val="es"/>
+        </w:rPr>
+        <w:t xml:space="preserve">tres entidades distintas</w:t>
+      </w:r>
+      <w:r>
+        <w:rPr>
+          <w:lang w:val="es"/>
+        </w:rPr>
+        <w:t xml:space="preserve"> </w:t>
+      </w:r>
+      <w:r>
+        <w:rPr>
+          <w:lang w:val="es"/>
+        </w:rPr>
+        <w:t xml:space="preserve">en el modelo:</w:t>
       </w:r>
     </w:p>
     <w:tbl>
@@ -8386,49 +8411,49 @@
               <w:rPr>
                 <w:lang w:val="es"/>
               </w:rPr>
-              <w:t xml:space="preserve">Se priorizó</w:t>
-            </w:r>
-          </w:p>
-        </w:tc>
-        <w:tc>
-          <w:tcPr/>
-          <w:p>
-            <w:pPr>
-              <w:pStyle w:val="Compact"/>
-            </w:pPr>
-            <w:r>
-              <w:rPr>
-                <w:lang w:val="es"/>
-              </w:rPr>
-              <w:t xml:space="preserve">Sobre</w:t>
-            </w:r>
-          </w:p>
-        </w:tc>
-        <w:tc>
-          <w:tcPr/>
-          <w:p>
-            <w:pPr>
-              <w:pStyle w:val="Compact"/>
-            </w:pPr>
-            <w:r>
-              <w:rPr>
-                <w:lang w:val="es"/>
-              </w:rPr>
-              <w:t xml:space="preserve">Por qué</w:t>
-            </w:r>
-          </w:p>
-        </w:tc>
-        <w:tc>
-          <w:tcPr/>
-          <w:p>
-            <w:pPr>
-              <w:pStyle w:val="Compact"/>
-            </w:pPr>
-            <w:r>
-              <w:rPr>
-                <w:lang w:val="es"/>
-              </w:rPr>
-              <w:t xml:space="preserve">Dónde se paga</w:t>
+              <w:t xml:space="preserve">Concepto</w:t>
+            </w:r>
+          </w:p>
+        </w:tc>
+        <w:tc>
+          <w:tcPr/>
+          <w:p>
+            <w:pPr>
+              <w:pStyle w:val="Compact"/>
+            </w:pPr>
+            <w:r>
+              <w:rPr>
+                <w:lang w:val="es"/>
+              </w:rPr>
+              <w:t xml:space="preserve">Entidad</w:t>
+            </w:r>
+          </w:p>
+        </w:tc>
+        <w:tc>
+          <w:tcPr/>
+          <w:p>
+            <w:pPr>
+              <w:pStyle w:val="Compact"/>
+            </w:pPr>
+            <w:r>
+              <w:rPr>
+                <w:lang w:val="es"/>
+              </w:rPr>
+              <w:t xml:space="preserve">Qué es</w:t>
+            </w:r>
+          </w:p>
+        </w:tc>
+        <w:tc>
+          <w:tcPr/>
+          <w:p>
+            <w:pPr>
+              <w:pStyle w:val="Compact"/>
+            </w:pPr>
+            <w:r>
+              <w:rPr>
+                <w:lang w:val="es"/>
+              </w:rPr>
+              <w:t xml:space="preserve">Cuántos hay</w:t>
             </w:r>
           </w:p>
         </w:tc>
@@ -8442,51 +8467,80 @@
             </w:pPr>
             <w:r>
               <w:rPr>
-                <w:lang w:val="es"/>
-              </w:rPr>
-              <w:t xml:space="preserve">Corrección del inventario</w:t>
-            </w:r>
-          </w:p>
-        </w:tc>
-        <w:tc>
-          <w:tcPr/>
-          <w:p>
-            <w:pPr>
-              <w:pStyle w:val="Compact"/>
-            </w:pPr>
-            <w:r>
-              <w:rPr>
-                <w:lang w:val="es"/>
-              </w:rPr>
-              <w:t xml:space="preserve">Disponibilidad de 99,99%</w:t>
-            </w:r>
-          </w:p>
-        </w:tc>
-        <w:tc>
-          <w:tcPr/>
-          <w:p>
-            <w:pPr>
-              <w:pStyle w:val="Compact"/>
-            </w:pPr>
-            <w:r>
-              <w:rPr>
-                <w:lang w:val="es"/>
-              </w:rPr>
-              <w:t xml:space="preserve">La sobreventa tiene costo regulatorio; 39 minutos extra de caída al mes, no</w:t>
-            </w:r>
-          </w:p>
-        </w:tc>
-        <w:tc>
-          <w:tcPr/>
-          <w:p>
-            <w:pPr>
-              <w:pStyle w:val="Compact"/>
-            </w:pPr>
-            <w:r>
-              <w:rPr>
-                <w:lang w:val="es"/>
-              </w:rPr>
-              <w:t xml:space="preserve">La disponibilidad se queda en 99,9%</w:t>
+                <w:b/>
+                <w:bCs/>
+                <w:lang w:val="es"/>
+              </w:rPr>
+              <w:t xml:space="preserve">Cabina</w:t>
+            </w:r>
+          </w:p>
+        </w:tc>
+        <w:tc>
+          <w:tcPr/>
+          <w:p>
+            <w:pPr>
+              <w:pStyle w:val="Compact"/>
+            </w:pPr>
+            <w:r>
+              <w:rPr>
+                <w:rStyle w:val="VerbatimChar"/>
+                <w:lang w:val="es"/>
+              </w:rPr>
+              <w:t xml:space="preserve">cabin</w:t>
+            </w:r>
+          </w:p>
+        </w:tc>
+        <w:tc>
+          <w:tcPr/>
+          <w:p>
+            <w:pPr>
+              <w:pStyle w:val="Compact"/>
+            </w:pPr>
+            <w:r>
+              <w:rPr>
+                <w:lang w:val="es"/>
+              </w:rPr>
+              <w:t xml:space="preserve">El espacio</w:t>
+            </w:r>
+            <w:r>
+              <w:rPr>
+                <w:lang w:val="es"/>
+              </w:rPr>
+              <w:t xml:space="preserve"> </w:t>
+            </w:r>
+            <w:r>
+              <w:rPr>
+                <w:b/>
+                <w:bCs/>
+                <w:lang w:val="es"/>
+              </w:rPr>
+              <w:t xml:space="preserve">físico</w:t>
+            </w:r>
+            <w:r>
+              <w:rPr>
+                <w:lang w:val="es"/>
+              </w:rPr>
+              <w:t xml:space="preserve"> </w:t>
+            </w:r>
+            <w:r>
+              <w:rPr>
+                <w:lang w:val="es"/>
+              </w:rPr>
+              <w:t xml:space="preserve">del avión. Es lo que controla el inventario (DEC-3)</w:t>
+            </w:r>
+          </w:p>
+        </w:tc>
+        <w:tc>
+          <w:tcPr/>
+          <w:p>
+            <w:pPr>
+              <w:pStyle w:val="Compact"/>
+            </w:pPr>
+            <w:r>
+              <w:rPr>
+                <w:lang w:val="es"/>
+              </w:rPr>
+              <w:t xml:space="preserve">2</w:t>
             </w:r>
           </w:p>
         </w:tc>
@@ -8500,51 +8554,80 @@
             </w:pPr>
             <w:r>
               <w:rPr>
-                <w:lang w:val="es"/>
-              </w:rPr>
-              <w:t xml:space="preserve">Rechazar rápido</w:t>
-            </w:r>
-          </w:p>
-        </w:tc>
-        <w:tc>
-          <w:tcPr/>
-          <w:p>
-            <w:pPr>
-              <w:pStyle w:val="Compact"/>
-            </w:pPr>
-            <w:r>
-              <w:rPr>
-                <w:lang w:val="es"/>
-              </w:rPr>
-              <w:t xml:space="preserve">Confirmar y luego revertir</w:t>
-            </w:r>
-          </w:p>
-        </w:tc>
-        <w:tc>
-          <w:tcPr/>
-          <w:p>
-            <w:pPr>
-              <w:pStyle w:val="Compact"/>
-            </w:pPr>
-            <w:r>
-              <w:rPr>
-                <w:lang w:val="es"/>
-              </w:rPr>
-              <w:t xml:space="preserve">Revertir una venta confirmada es peor que negarla</w:t>
-            </w:r>
-          </w:p>
-        </w:tc>
-        <w:tc>
-          <w:tcPr/>
-          <w:p>
-            <w:pPr>
-              <w:pStyle w:val="Compact"/>
-            </w:pPr>
-            <w:r>
-              <w:rPr>
-                <w:lang w:val="es"/>
-              </w:rPr>
-              <w:t xml:space="preserve">Bloqueo pesimista: menor rendimiento en el punto de contención</w:t>
+                <w:b/>
+                <w:bCs/>
+                <w:lang w:val="es"/>
+              </w:rPr>
+              <w:t xml:space="preserve">Clase tarifaria</w:t>
+            </w:r>
+          </w:p>
+        </w:tc>
+        <w:tc>
+          <w:tcPr/>
+          <w:p>
+            <w:pPr>
+              <w:pStyle w:val="Compact"/>
+            </w:pPr>
+            <w:r>
+              <w:rPr>
+                <w:rStyle w:val="VerbatimChar"/>
+                <w:lang w:val="es"/>
+              </w:rPr>
+              <w:t xml:space="preserve">fare_class</w:t>
+            </w:r>
+          </w:p>
+        </w:tc>
+        <w:tc>
+          <w:tcPr/>
+          <w:p>
+            <w:pPr>
+              <w:pStyle w:val="Compact"/>
+            </w:pPr>
+            <w:r>
+              <w:rPr>
+                <w:lang w:val="es"/>
+              </w:rPr>
+              <w:t xml:space="preserve">El</w:t>
+            </w:r>
+            <w:r>
+              <w:rPr>
+                <w:lang w:val="es"/>
+              </w:rPr>
+              <w:t xml:space="preserve"> </w:t>
+            </w:r>
+            <w:r>
+              <w:rPr>
+                <w:b/>
+                <w:bCs/>
+                <w:lang w:val="es"/>
+              </w:rPr>
+              <w:t xml:space="preserve">producto comercial</w:t>
+            </w:r>
+            <w:r>
+              <w:rPr>
+                <w:lang w:val="es"/>
+              </w:rPr>
+              <w:t xml:space="preserve"> </w:t>
+            </w:r>
+            <w:r>
+              <w:rPr>
+                <w:lang w:val="es"/>
+              </w:rPr>
+              <w:t xml:space="preserve">que se vende dentro de una cabina</w:t>
+            </w:r>
+          </w:p>
+        </w:tc>
+        <w:tc>
+          <w:tcPr/>
+          <w:p>
+            <w:pPr>
+              <w:pStyle w:val="Compact"/>
+            </w:pPr>
+            <w:r>
+              <w:rPr>
+                <w:lang w:val="es"/>
+              </w:rPr>
+              <w:t xml:space="preserve">4</w:t>
             </w:r>
           </w:p>
         </w:tc>
@@ -8558,51 +8641,152 @@
             </w:pPr>
             <w:r>
               <w:rPr>
-                <w:lang w:val="es"/>
-              </w:rPr>
-              <w:t xml:space="preserve">Delegar el pago</w:t>
-            </w:r>
-          </w:p>
-        </w:tc>
-        <w:tc>
-          <w:tcPr/>
-          <w:p>
-            <w:pPr>
-              <w:pStyle w:val="Compact"/>
-            </w:pPr>
-            <w:r>
-              <w:rPr>
-                <w:lang w:val="es"/>
-              </w:rPr>
-              <w:t xml:space="preserve">Controlar el flujo de pago</w:t>
-            </w:r>
-          </w:p>
-        </w:tc>
-        <w:tc>
-          <w:tcPr/>
-          <w:p>
-            <w:pPr>
-              <w:pStyle w:val="Compact"/>
-            </w:pPr>
-            <w:r>
-              <w:rPr>
-                <w:lang w:val="es"/>
-              </w:rPr>
-              <w:t xml:space="preserve">Reduce el alcance PCI a SAQ-A</w:t>
-            </w:r>
-          </w:p>
-        </w:tc>
-        <w:tc>
-          <w:tcPr/>
-          <w:p>
-            <w:pPr>
-              <w:pStyle w:val="Compact"/>
-            </w:pPr>
-            <w:r>
-              <w:rPr>
-                <w:lang w:val="es"/>
-              </w:rPr>
-              <w:t xml:space="preserve">Dependencia de un tercero, mitigada con conciliación</w:t>
+                <w:b/>
+                <w:bCs/>
+                <w:lang w:val="es"/>
+              </w:rPr>
+              <w:t xml:space="preserve">Regla tarifaria</w:t>
+            </w:r>
+          </w:p>
+        </w:tc>
+        <w:tc>
+          <w:tcPr/>
+          <w:p>
+            <w:pPr>
+              <w:pStyle w:val="Compact"/>
+            </w:pPr>
+            <w:r>
+              <w:rPr>
+                <w:rStyle w:val="VerbatimChar"/>
+                <w:lang w:val="es"/>
+              </w:rPr>
+              <w:t xml:space="preserve">fare_rule</w:t>
+            </w:r>
+          </w:p>
+        </w:tc>
+        <w:tc>
+          <w:tcPr/>
+          <w:p>
+            <w:pPr>
+              <w:pStyle w:val="Compact"/>
+            </w:pPr>
+            <w:r>
+              <w:rPr>
+                <w:lang w:val="es"/>
+              </w:rPr>
+              <w:t xml:space="preserve">Las</w:t>
+            </w:r>
+            <w:r>
+              <w:rPr>
+                <w:lang w:val="es"/>
+              </w:rPr>
+              <w:t xml:space="preserve"> </w:t>
+            </w:r>
+            <w:r>
+              <w:rPr>
+                <w:b/>
+                <w:bCs/>
+                <w:lang w:val="es"/>
+              </w:rPr>
+              <w:t xml:space="preserve">condiciones</w:t>
+            </w:r>
+            <w:r>
+              <w:rPr>
+                <w:lang w:val="es"/>
+              </w:rPr>
+              <w:t xml:space="preserve"> </w:t>
+            </w:r>
+            <w:r>
+              <w:rPr>
+                <w:lang w:val="es"/>
+              </w:rPr>
+              <w:t xml:space="preserve">que acompañan a ese producto</w:t>
+            </w:r>
+          </w:p>
+        </w:tc>
+        <w:tc>
+          <w:tcPr/>
+          <w:p>
+            <w:pPr>
+              <w:pStyle w:val="Compact"/>
+            </w:pPr>
+            <w:r>
+              <w:rPr>
+                <w:lang w:val="es"/>
+              </w:rPr>
+              <w:t xml:space="preserve">4</w:t>
+            </w:r>
+          </w:p>
+        </w:tc>
+      </w:tr>
+    </w:tbl>
+    <w:bookmarkStart w:id="32" w:name="las-dos-cabinas"/>
+    <w:p>
+      <w:pPr>
+        <w:pStyle w:val="Heading4"/>
+      </w:pPr>
+      <w:r>
+        <w:rPr>
+          <w:lang w:val="es"/>
+        </w:rPr>
+        <w:t xml:space="preserve">Las dos cabinas</w:t>
+      </w:r>
+    </w:p>
+    <w:tbl>
+      <w:tblPr>
+        <w:tblStyle w:val="Table"/>
+        <w:tblW w:type="auto" w:w="0"/>
+        <w:tblLook w:firstRow="1" w:lastRow="0" w:firstColumn="0" w:lastColumn="0" w:noHBand="0" w:noVBand="0" w:val="0020"/>
+      </w:tblPr>
+      <w:tblGrid>
+        <w:gridCol w:w="2640"/>
+        <w:gridCol w:w="2640"/>
+        <w:gridCol w:w="2640"/>
+      </w:tblGrid>
+      <w:tr>
+        <w:trPr>
+          <w:tblHeader w:val="on"/>
+        </w:trPr>
+        <w:tc>
+          <w:tcPr/>
+          <w:p>
+            <w:pPr>
+              <w:pStyle w:val="Compact"/>
+            </w:pPr>
+            <w:r>
+              <w:rPr>
+                <w:lang w:val="es"/>
+              </w:rPr>
+              <w:t xml:space="preserve">Código</w:t>
+            </w:r>
+          </w:p>
+        </w:tc>
+        <w:tc>
+          <w:tcPr/>
+          <w:p>
+            <w:pPr>
+              <w:pStyle w:val="Compact"/>
+            </w:pPr>
+            <w:r>
+              <w:rPr>
+                <w:lang w:val="es"/>
+              </w:rPr>
+              <w:t xml:space="preserve">Nombre</w:t>
+            </w:r>
+          </w:p>
+        </w:tc>
+        <w:tc>
+          <w:tcPr/>
+          <w:p>
+            <w:pPr>
+              <w:pStyle w:val="Compact"/>
+            </w:pPr>
+            <w:r>
+              <w:rPr>
+                <w:rStyle w:val="VerbatimChar"/>
+                <w:lang w:val="es"/>
+              </w:rPr>
+              <w:t xml:space="preserve">boarding_priority</w:t>
             </w:r>
           </w:p>
         </w:tc>
@@ -8616,51 +8800,38 @@
             </w:pPr>
             <w:r>
               <w:rPr>
-                <w:lang w:val="es"/>
-              </w:rPr>
-              <w:t xml:space="preserve">Un PNR por viaje</w:t>
-            </w:r>
-          </w:p>
-        </w:tc>
-        <w:tc>
-          <w:tcPr/>
-          <w:p>
-            <w:pPr>
-              <w:pStyle w:val="Compact"/>
-            </w:pPr>
-            <w:r>
-              <w:rPr>
-                <w:lang w:val="es"/>
-              </w:rPr>
-              <w:t xml:space="preserve">Simplicidad del modelo</w:t>
-            </w:r>
-          </w:p>
-        </w:tc>
-        <w:tc>
-          <w:tcPr/>
-          <w:p>
-            <w:pPr>
-              <w:pStyle w:val="Compact"/>
-            </w:pPr>
-            <w:r>
-              <w:rPr>
-                <w:lang w:val="es"/>
-              </w:rPr>
-              <w:t xml:space="preserve">El pasajero compra un viaje, no tramos sueltos</w:t>
-            </w:r>
-          </w:p>
-        </w:tc>
-        <w:tc>
-          <w:tcPr/>
-          <w:p>
-            <w:pPr>
-              <w:pStyle w:val="Compact"/>
-            </w:pPr>
-            <w:r>
-              <w:rPr>
-                <w:lang w:val="es"/>
-              </w:rPr>
-              <w:t xml:space="preserve">Una entidad adicional y transacciones más largas</w:t>
+                <w:rStyle w:val="VerbatimChar"/>
+                <w:lang w:val="es"/>
+              </w:rPr>
+              <w:t xml:space="preserve">BUS</w:t>
+            </w:r>
+          </w:p>
+        </w:tc>
+        <w:tc>
+          <w:tcPr/>
+          <w:p>
+            <w:pPr>
+              <w:pStyle w:val="Compact"/>
+            </w:pPr>
+            <w:r>
+              <w:rPr>
+                <w:lang w:val="es"/>
+              </w:rPr>
+              <w:t xml:space="preserve">Ejecutiva</w:t>
+            </w:r>
+          </w:p>
+        </w:tc>
+        <w:tc>
+          <w:tcPr/>
+          <w:p>
+            <w:pPr>
+              <w:pStyle w:val="Compact"/>
+            </w:pPr>
+            <w:r>
+              <w:rPr>
+                <w:lang w:val="es"/>
+              </w:rPr>
+              <w:t xml:space="preserve">1</w:t>
             </w:r>
           </w:p>
         </w:tc>
@@ -8674,65 +8845,379 @@
             </w:pPr>
             <w:r>
               <w:rPr>
-                <w:lang w:val="es"/>
-              </w:rPr>
-              <w:t xml:space="preserve">Monolito modular</w:t>
-            </w:r>
-          </w:p>
-        </w:tc>
-        <w:tc>
-          <w:tcPr/>
-          <w:p>
-            <w:pPr>
-              <w:pStyle w:val="Compact"/>
-            </w:pPr>
-            <w:r>
-              <w:rPr>
-                <w:lang w:val="es"/>
-              </w:rPr>
-              <w:t xml:space="preserve">Microservicios</w:t>
-            </w:r>
-          </w:p>
-        </w:tc>
-        <w:tc>
-          <w:tcPr/>
-          <w:p>
-            <w:pPr>
-              <w:pStyle w:val="Compact"/>
-            </w:pPr>
-            <w:r>
-              <w:rPr>
-                <w:lang w:val="es"/>
-              </w:rPr>
-              <w:t xml:space="preserve">La garantía de inventario</w:t>
-            </w:r>
-            <w:r>
-              <w:rPr>
-                <w:lang w:val="es"/>
-              </w:rPr>
-              <w:t xml:space="preserve"> </w:t>
-            </w:r>
+                <w:rStyle w:val="VerbatimChar"/>
+                <w:lang w:val="es"/>
+              </w:rPr>
+              <w:t xml:space="preserve">ECO</w:t>
+            </w:r>
+          </w:p>
+        </w:tc>
+        <w:tc>
+          <w:tcPr/>
+          <w:p>
+            <w:pPr>
+              <w:pStyle w:val="Compact"/>
+            </w:pPr>
+            <w:r>
+              <w:rPr>
+                <w:lang w:val="es"/>
+              </w:rPr>
+              <w:t xml:space="preserve">Económica</w:t>
+            </w:r>
+          </w:p>
+        </w:tc>
+        <w:tc>
+          <w:tcPr/>
+          <w:p>
+            <w:pPr>
+              <w:pStyle w:val="Compact"/>
+            </w:pPr>
+            <w:r>
+              <w:rPr>
+                <w:lang w:val="es"/>
+              </w:rPr>
+              <w:t xml:space="preserve">2</w:t>
+            </w:r>
+          </w:p>
+        </w:tc>
+      </w:tr>
+    </w:tbl>
+    <w:p>
+      <w:pPr>
+        <w:pStyle w:val="BodyText"/>
+      </w:pPr>
+      <w:r>
+        <w:rPr>
+          <w:lang w:val="es"/>
+        </w:rPr>
+        <w:t xml:space="preserve">Son entidad y no un tipo</w:t>
+      </w:r>
+      <w:r>
+        <w:rPr>
+          <w:lang w:val="es"/>
+        </w:rPr>
+        <w:t xml:space="preserve"> </w:t>
+      </w:r>
+      <w:r>
+        <w:rPr>
+          <w:rStyle w:val="VerbatimChar"/>
+          <w:lang w:val="es"/>
+        </w:rPr>
+        <w:t xml:space="preserve">ENUM</w:t>
+      </w:r>
+      <w:r>
+        <w:rPr>
+          <w:lang w:val="es"/>
+        </w:rPr>
+        <w:t xml:space="preserve"> </w:t>
+      </w:r>
+      <w:r>
+        <w:rPr>
+          <w:lang w:val="es"/>
+        </w:rPr>
+        <w:t xml:space="preserve">por una razón práctica: agregar una cabina</w:t>
+      </w:r>
+      <w:r>
+        <w:rPr>
+          <w:lang w:val="es"/>
+        </w:rPr>
+        <w:t xml:space="preserve"> </w:t>
+      </w:r>
+      <w:r>
+        <w:rPr>
+          <w:rStyle w:val="VerbatimChar"/>
+          <w:lang w:val="es"/>
+        </w:rPr>
+        <w:t xml:space="preserve">PREMIUM_ECO</w:t>
+      </w:r>
+      <w:r>
+        <w:rPr>
+          <w:lang w:val="es"/>
+        </w:rPr>
+        <w:t xml:space="preserve"> </w:t>
+      </w:r>
+      <w:r>
+        <w:rPr>
+          <w:lang w:val="es"/>
+        </w:rPr>
+        <w:t xml:space="preserve">debe ser un</w:t>
+      </w:r>
+      <w:r>
+        <w:rPr>
+          <w:lang w:val="es"/>
+        </w:rPr>
+        <w:t xml:space="preserve"> </w:t>
+      </w:r>
+      <w:r>
+        <w:rPr>
+          <w:rStyle w:val="VerbatimChar"/>
+          <w:lang w:val="es"/>
+        </w:rPr>
+        <w:t xml:space="preserve">INSERT</w:t>
+      </w:r>
+      <w:r>
+        <w:rPr>
+          <w:lang w:val="es"/>
+        </w:rPr>
+        <w:t xml:space="preserve">, no una migración de tipo de dato que obligue a reescribir la tabla.</w:t>
+      </w:r>
+    </w:p>
+    <w:bookmarkEnd w:id="32"/>
+    <w:bookmarkStart w:id="33" w:name="Xe96cb0f20800fd219420933dd0e7ae6d39d8868"/>
+    <w:p>
+      <w:pPr>
+        <w:pStyle w:val="Heading4"/>
+      </w:pPr>
+      <w:r>
+        <w:rPr>
+          <w:lang w:val="es"/>
+        </w:rPr>
+        <w:t xml:space="preserve">Las cuatro clases tarifarias, y el porqué de su orden</w:t>
+      </w:r>
+    </w:p>
+    <w:p>
+      <w:pPr>
+        <w:pStyle w:val="FirstParagraph"/>
+      </w:pPr>
+      <w:r>
+        <w:rPr>
+          <w:rStyle w:val="VerbatimChar"/>
+          <w:lang w:val="es"/>
+        </w:rPr>
+        <w:t xml:space="preserve">fare_class</w:t>
+      </w:r>
+      <w:r>
+        <w:rPr>
+          <w:lang w:val="es"/>
+        </w:rPr>
+        <w:t xml:space="preserve"> </w:t>
+      </w:r>
+      <w:r>
+        <w:rPr>
+          <w:lang w:val="es"/>
+        </w:rPr>
+        <w:t xml:space="preserve">tiene una columna</w:t>
+      </w:r>
+      <w:r>
+        <w:rPr>
+          <w:lang w:val="es"/>
+        </w:rPr>
+        <w:t xml:space="preserve"> </w:t>
+      </w:r>
+      <w:r>
+        <w:rPr>
+          <w:rStyle w:val="VerbatimChar"/>
+          <w:b/>
+          <w:bCs/>
+          <w:lang w:val="es"/>
+        </w:rPr>
+        <w:t xml:space="preserve">rank</w:t>
+      </w:r>
+      <w:r>
+        <w:rPr>
+          <w:lang w:val="es"/>
+        </w:rPr>
+        <w:t xml:space="preserve"> </w:t>
+      </w:r>
+      <w:r>
+        <w:rPr>
+          <w:lang w:val="es"/>
+        </w:rPr>
+        <w:t xml:space="preserve">que las ordena explícitamente:</w:t>
+      </w:r>
+    </w:p>
+    <w:tbl>
+      <w:tblPr>
+        <w:tblStyle w:val="Table"/>
+        <w:tblW w:type="auto" w:w="0"/>
+        <w:tblLook w:firstRow="1" w:lastRow="0" w:firstColumn="0" w:lastColumn="0" w:noHBand="0" w:noVBand="0" w:val="0020"/>
+      </w:tblPr>
+      <w:tblGrid>
+        <w:gridCol w:w="1320"/>
+        <w:gridCol w:w="1320"/>
+        <w:gridCol w:w="1320"/>
+        <w:gridCol w:w="1320"/>
+        <w:gridCol w:w="1320"/>
+        <w:gridCol w:w="1320"/>
+      </w:tblGrid>
+      <w:tr>
+        <w:trPr>
+          <w:tblHeader w:val="on"/>
+        </w:trPr>
+        <w:tc>
+          <w:tcPr/>
+          <w:p>
+            <w:pPr>
+              <w:pStyle w:val="Compact"/>
+            </w:pPr>
+            <w:r>
+              <w:rPr>
+                <w:rStyle w:val="VerbatimChar"/>
+                <w:lang w:val="es"/>
+              </w:rPr>
+              <w:t xml:space="preserve">rank</w:t>
+            </w:r>
+          </w:p>
+        </w:tc>
+        <w:tc>
+          <w:tcPr/>
+          <w:p>
+            <w:pPr>
+              <w:pStyle w:val="Compact"/>
+            </w:pPr>
+            <w:r>
+              <w:rPr>
+                <w:lang w:val="es"/>
+              </w:rPr>
+              <w:t xml:space="preserve">Código</w:t>
+            </w:r>
+          </w:p>
+        </w:tc>
+        <w:tc>
+          <w:tcPr/>
+          <w:p>
+            <w:pPr>
+              <w:pStyle w:val="Compact"/>
+            </w:pPr>
+            <w:r>
+              <w:rPr>
+                <w:lang w:val="es"/>
+              </w:rPr>
+              <w:t xml:space="preserve">Nombre</w:t>
+            </w:r>
+          </w:p>
+        </w:tc>
+        <w:tc>
+          <w:tcPr/>
+          <w:p>
+            <w:pPr>
+              <w:pStyle w:val="Compact"/>
+            </w:pPr>
+            <w:r>
+              <w:rPr>
+                <w:lang w:val="es"/>
+              </w:rPr>
+              <w:t xml:space="preserve">Cabina</w:t>
+            </w:r>
+          </w:p>
+        </w:tc>
+        <w:tc>
+          <w:tcPr/>
+          <w:p>
+            <w:pPr>
+              <w:pStyle w:val="Compact"/>
+            </w:pPr>
+            <w:r>
+              <w:rPr>
+                <w:lang w:val="es"/>
+              </w:rPr>
+              <w:t xml:space="preserve">Regla asociada</w:t>
+            </w:r>
+          </w:p>
+        </w:tc>
+        <w:tc>
+          <w:tcPr/>
+          <w:p>
+            <w:pPr>
+              <w:pStyle w:val="Compact"/>
+            </w:pPr>
+            <w:r>
+              <w:rPr>
+                <w:lang w:val="es"/>
+              </w:rPr>
+              <w:t xml:space="preserve">Anticipación mínima</w:t>
+            </w:r>
+          </w:p>
+        </w:tc>
+      </w:tr>
+      <w:tr>
+        <w:tc>
+          <w:tcPr/>
+          <w:p>
+            <w:pPr>
+              <w:pStyle w:val="Compact"/>
+            </w:pPr>
             <w:r>
               <w:rPr>
                 <w:b/>
                 <w:bCs/>
                 <w:lang w:val="es"/>
               </w:rPr>
-              <w:t xml:space="preserve">cabe en una transacción de base de datos</w:t>
-            </w:r>
-          </w:p>
-        </w:tc>
-        <w:tc>
-          <w:tcPr/>
-          <w:p>
-            <w:pPr>
-              <w:pStyle w:val="Compact"/>
-            </w:pPr>
-            <w:r>
-              <w:rPr>
-                <w:lang w:val="es"/>
-              </w:rPr>
-              <w:t xml:space="preserve">Escalado menos granular, aceptable a esta escala</w:t>
+              <w:t xml:space="preserve">1</w:t>
+            </w:r>
+          </w:p>
+        </w:tc>
+        <w:tc>
+          <w:tcPr/>
+          <w:p>
+            <w:pPr>
+              <w:pStyle w:val="Compact"/>
+            </w:pPr>
+            <w:r>
+              <w:rPr>
+                <w:rStyle w:val="VerbatimChar"/>
+                <w:lang w:val="es"/>
+              </w:rPr>
+              <w:t xml:space="preserve">P</w:t>
+            </w:r>
+          </w:p>
+        </w:tc>
+        <w:tc>
+          <w:tcPr/>
+          <w:p>
+            <w:pPr>
+              <w:pStyle w:val="Compact"/>
+            </w:pPr>
+            <w:r>
+              <w:rPr>
+                <w:lang w:val="es"/>
+              </w:rPr>
+              <w:t xml:space="preserve">Económica promo</w:t>
+            </w:r>
+          </w:p>
+        </w:tc>
+        <w:tc>
+          <w:tcPr/>
+          <w:p>
+            <w:pPr>
+              <w:pStyle w:val="Compact"/>
+            </w:pPr>
+            <w:r>
+              <w:rPr>
+                <w:rStyle w:val="VerbatimChar"/>
+                <w:lang w:val="es"/>
+              </w:rPr>
+              <w:t xml:space="preserve">ECO</w:t>
+            </w:r>
+          </w:p>
+        </w:tc>
+        <w:tc>
+          <w:tcPr/>
+          <w:p>
+            <w:pPr>
+              <w:pStyle w:val="Compact"/>
+            </w:pPr>
+            <w:r>
+              <w:rPr>
+                <w:lang w:val="es"/>
+              </w:rPr>
+              <w:t xml:space="preserve">Promo anticipada 21d</w:t>
+            </w:r>
+          </w:p>
+        </w:tc>
+        <w:tc>
+          <w:tcPr/>
+          <w:p>
+            <w:pPr>
+              <w:pStyle w:val="Compact"/>
+            </w:pPr>
+            <w:r>
+              <w:rPr>
+                <w:b/>
+                <w:bCs/>
+                <w:lang w:val="es"/>
+              </w:rPr>
+              <w:t xml:space="preserve">21 días</w:t>
             </w:r>
           </w:p>
         </w:tc>
@@ -8746,51 +9231,269 @@
             </w:pPr>
             <w:r>
               <w:rPr>
-                <w:lang w:val="es"/>
-              </w:rPr>
-              <w:t xml:space="preserve">Frescura diaria del ETL</w:t>
-            </w:r>
-          </w:p>
-        </w:tc>
-        <w:tc>
-          <w:tcPr/>
-          <w:p>
-            <w:pPr>
-              <w:pStyle w:val="Compact"/>
-            </w:pPr>
-            <w:r>
-              <w:rPr>
-                <w:lang w:val="es"/>
-              </w:rPr>
-              <w:t xml:space="preserve">Datos en tiempo real</w:t>
-            </w:r>
-          </w:p>
-        </w:tc>
-        <w:tc>
-          <w:tcPr/>
-          <w:p>
-            <w:pPr>
-              <w:pStyle w:val="Compact"/>
-            </w:pPr>
-            <w:r>
-              <w:rPr>
-                <w:lang w:val="es"/>
-              </w:rPr>
-              <w:t xml:space="preserve">Las preguntas de gerencia son tácticas, no operativas</w:t>
-            </w:r>
-          </w:p>
-        </w:tc>
-        <w:tc>
-          <w:tcPr/>
-          <w:p>
-            <w:pPr>
-              <w:pStyle w:val="Compact"/>
-            </w:pPr>
-            <w:r>
-              <w:rPr>
-                <w:lang w:val="es"/>
-              </w:rPr>
-              <w:t xml:space="preserve">Ninguno relevante: mejorar la frescura cuesta menos de 1 USD/mes</w:t>
+                <w:b/>
+                <w:bCs/>
+                <w:lang w:val="es"/>
+              </w:rPr>
+              <w:t xml:space="preserve">2</w:t>
+            </w:r>
+          </w:p>
+        </w:tc>
+        <w:tc>
+          <w:tcPr/>
+          <w:p>
+            <w:pPr>
+              <w:pStyle w:val="Compact"/>
+            </w:pPr>
+            <w:r>
+              <w:rPr>
+                <w:rStyle w:val="VerbatimChar"/>
+                <w:lang w:val="es"/>
+              </w:rPr>
+              <w:t xml:space="preserve">Y</w:t>
+            </w:r>
+          </w:p>
+        </w:tc>
+        <w:tc>
+          <w:tcPr/>
+          <w:p>
+            <w:pPr>
+              <w:pStyle w:val="Compact"/>
+            </w:pPr>
+            <w:r>
+              <w:rPr>
+                <w:lang w:val="es"/>
+              </w:rPr>
+              <w:t xml:space="preserve">Económica estándar</w:t>
+            </w:r>
+          </w:p>
+        </w:tc>
+        <w:tc>
+          <w:tcPr/>
+          <w:p>
+            <w:pPr>
+              <w:pStyle w:val="Compact"/>
+            </w:pPr>
+            <w:r>
+              <w:rPr>
+                <w:rStyle w:val="VerbatimChar"/>
+                <w:lang w:val="es"/>
+              </w:rPr>
+              <w:t xml:space="preserve">ECO</w:t>
+            </w:r>
+          </w:p>
+        </w:tc>
+        <w:tc>
+          <w:tcPr/>
+          <w:p>
+            <w:pPr>
+              <w:pStyle w:val="Compact"/>
+            </w:pPr>
+            <w:r>
+              <w:rPr>
+                <w:lang w:val="es"/>
+              </w:rPr>
+              <w:t xml:space="preserve">Estándar 7d</w:t>
+            </w:r>
+          </w:p>
+        </w:tc>
+        <w:tc>
+          <w:tcPr/>
+          <w:p>
+            <w:pPr>
+              <w:pStyle w:val="Compact"/>
+            </w:pPr>
+            <w:r>
+              <w:rPr>
+                <w:b/>
+                <w:bCs/>
+                <w:lang w:val="es"/>
+              </w:rPr>
+              <w:t xml:space="preserve">7 días</w:t>
+            </w:r>
+          </w:p>
+        </w:tc>
+      </w:tr>
+      <w:tr>
+        <w:tc>
+          <w:tcPr/>
+          <w:p>
+            <w:pPr>
+              <w:pStyle w:val="Compact"/>
+            </w:pPr>
+            <w:r>
+              <w:rPr>
+                <w:b/>
+                <w:bCs/>
+                <w:lang w:val="es"/>
+              </w:rPr>
+              <w:t xml:space="preserve">3</w:t>
+            </w:r>
+          </w:p>
+        </w:tc>
+        <w:tc>
+          <w:tcPr/>
+          <w:p>
+            <w:pPr>
+              <w:pStyle w:val="Compact"/>
+            </w:pPr>
+            <w:r>
+              <w:rPr>
+                <w:rStyle w:val="VerbatimChar"/>
+                <w:lang w:val="es"/>
+              </w:rPr>
+              <w:t xml:space="preserve">B</w:t>
+            </w:r>
+          </w:p>
+        </w:tc>
+        <w:tc>
+          <w:tcPr/>
+          <w:p>
+            <w:pPr>
+              <w:pStyle w:val="Compact"/>
+            </w:pPr>
+            <w:r>
+              <w:rPr>
+                <w:lang w:val="es"/>
+              </w:rPr>
+              <w:t xml:space="preserve">Económica flexible</w:t>
+            </w:r>
+          </w:p>
+        </w:tc>
+        <w:tc>
+          <w:tcPr/>
+          <w:p>
+            <w:pPr>
+              <w:pStyle w:val="Compact"/>
+            </w:pPr>
+            <w:r>
+              <w:rPr>
+                <w:rStyle w:val="VerbatimChar"/>
+                <w:lang w:val="es"/>
+              </w:rPr>
+              <w:t xml:space="preserve">ECO</w:t>
+            </w:r>
+          </w:p>
+        </w:tc>
+        <w:tc>
+          <w:tcPr/>
+          <w:p>
+            <w:pPr>
+              <w:pStyle w:val="Compact"/>
+            </w:pPr>
+            <w:r>
+              <w:rPr>
+                <w:lang w:val="es"/>
+              </w:rPr>
+              <w:t xml:space="preserve">Flexible</w:t>
+            </w:r>
+          </w:p>
+        </w:tc>
+        <w:tc>
+          <w:tcPr/>
+          <w:p>
+            <w:pPr>
+              <w:pStyle w:val="Compact"/>
+            </w:pPr>
+            <w:r>
+              <w:rPr>
+                <w:b/>
+                <w:bCs/>
+                <w:lang w:val="es"/>
+              </w:rPr>
+              <w:t xml:space="preserve">0 días</w:t>
+            </w:r>
+          </w:p>
+        </w:tc>
+      </w:tr>
+      <w:tr>
+        <w:tc>
+          <w:tcPr/>
+          <w:p>
+            <w:pPr>
+              <w:pStyle w:val="Compact"/>
+            </w:pPr>
+            <w:r>
+              <w:rPr>
+                <w:b/>
+                <w:bCs/>
+                <w:lang w:val="es"/>
+              </w:rPr>
+              <w:t xml:space="preserve">4</w:t>
+            </w:r>
+          </w:p>
+        </w:tc>
+        <w:tc>
+          <w:tcPr/>
+          <w:p>
+            <w:pPr>
+              <w:pStyle w:val="Compact"/>
+            </w:pPr>
+            <w:r>
+              <w:rPr>
+                <w:rStyle w:val="VerbatimChar"/>
+                <w:lang w:val="es"/>
+              </w:rPr>
+              <w:t xml:space="preserve">J</w:t>
+            </w:r>
+          </w:p>
+        </w:tc>
+        <w:tc>
+          <w:tcPr/>
+          <w:p>
+            <w:pPr>
+              <w:pStyle w:val="Compact"/>
+            </w:pPr>
+            <w:r>
+              <w:rPr>
+                <w:lang w:val="es"/>
+              </w:rPr>
+              <w:t xml:space="preserve">Ejecutiva</w:t>
+            </w:r>
+          </w:p>
+        </w:tc>
+        <w:tc>
+          <w:tcPr/>
+          <w:p>
+            <w:pPr>
+              <w:pStyle w:val="Compact"/>
+            </w:pPr>
+            <w:r>
+              <w:rPr>
+                <w:rStyle w:val="VerbatimChar"/>
+                <w:lang w:val="es"/>
+              </w:rPr>
+              <w:t xml:space="preserve">BUS</w:t>
+            </w:r>
+          </w:p>
+        </w:tc>
+        <w:tc>
+          <w:tcPr/>
+          <w:p>
+            <w:pPr>
+              <w:pStyle w:val="Compact"/>
+            </w:pPr>
+            <w:r>
+              <w:rPr>
+                <w:lang w:val="es"/>
+              </w:rPr>
+              <w:t xml:space="preserve">Ejecutiva flexible</w:t>
+            </w:r>
+          </w:p>
+        </w:tc>
+        <w:tc>
+          <w:tcPr/>
+          <w:p>
+            <w:pPr>
+              <w:pStyle w:val="Compact"/>
+            </w:pPr>
+            <w:r>
+              <w:rPr>
+                <w:b/>
+                <w:bCs/>
+                <w:lang w:val="es"/>
+              </w:rPr>
+              <w:t xml:space="preserve">0 días</w:t>
             </w:r>
           </w:p>
         </w:tc>
@@ -8802,65 +9505,3239 @@
       </w:pPr>
       <w:r>
         <w:rPr>
-          <w:lang w:val="es"/>
-        </w:rPr>
-        <w:t xml:space="preserve">La última fila merece una nota, porque es contraintuitiva y es de las más defendibles:</w:t>
-      </w:r>
-      <w:r>
-        <w:rPr>
-          <w:lang w:val="es"/>
-        </w:rPr>
-        <w:t xml:space="preserve"> </w:t>
-      </w:r>
-      <w:r>
-        <w:rPr>
-          <w:b/>
-          <w:bCs/>
-          <w:lang w:val="es"/>
-        </w:rPr>
-        <w:t xml:space="preserve">la decisión de correr el ETL una vez al día no es económica.</w:t>
-      </w:r>
-      <w:r>
-        <w:rPr>
-          <w:lang w:val="es"/>
-        </w:rPr>
-        <w:t xml:space="preserve"> </w:t>
-      </w:r>
-      <w:r>
-        <w:rPr>
-          <w:lang w:val="es"/>
-        </w:rPr>
-        <w:t xml:space="preserve">Multiplicar la frecuencia por 10 sube la factura apenas un 2%, porque el costo está dominado por las bases encendidas, no por el cómputo del ETL. La restricción a diario es de</w:t>
-      </w:r>
-      <w:r>
-        <w:rPr>
-          <w:lang w:val="es"/>
-        </w:rPr>
-        <w:t xml:space="preserve"> </w:t>
-      </w:r>
-      <w:r>
-        <w:rPr>
-          <w:b/>
-          <w:bCs/>
-          <w:lang w:val="es"/>
-        </w:rPr>
-        <w:t xml:space="preserve">valor de negocio</w:t>
-      </w:r>
-      <w:r>
-        <w:rPr>
-          <w:lang w:val="es"/>
-        </w:rPr>
-        <w:t xml:space="preserve"> </w:t>
-      </w:r>
-      <w:r>
-        <w:rPr>
-          <w:lang w:val="es"/>
-        </w:rPr>
-        <w:t xml:space="preserve">— nadie cambia una ruta por lo que pasó hace diez minutos. Confundir ambas cosas llevaría a negar una mejora que es prácticamente gratis.</w:t>
+          <w:b/>
+          <w:bCs/>
+          <w:lang w:val="es"/>
+        </w:rPr>
+        <w:t xml:space="preserve">El orden no es alfabético ni por precio: es por grado de restricción, de la más restrictiva a la más flexible.</w:t>
+      </w:r>
+      <w:r>
+        <w:rPr>
+          <w:lang w:val="es"/>
+        </w:rPr>
+        <w:t xml:space="preserve"> </w:t>
+      </w:r>
+      <w:r>
+        <w:rPr>
+          <w:lang w:val="es"/>
+        </w:rPr>
+        <w:t xml:space="preserve">Y esa es la respuesta a por qué existen tres clases distintas dentro de una misma cabina:</w:t>
+      </w:r>
+    </w:p>
+    <w:p>
+      <w:pPr>
+        <w:pStyle w:val="BlockText"/>
+      </w:pPr>
+      <w:r>
+        <w:rPr>
+          <w:rStyle w:val="VerbatimChar"/>
+          <w:b/>
+          <w:bCs/>
+          <w:lang w:val="es"/>
+        </w:rPr>
+        <w:t xml:space="preserve">P</w:t>
+      </w:r>
+      <w:r>
+        <w:rPr>
+          <w:b/>
+          <w:bCs/>
+          <w:lang w:val="es"/>
+        </w:rPr>
+        <w:t xml:space="preserve">,</w:t>
+      </w:r>
+      <w:r>
+        <w:rPr>
+          <w:b/>
+          <w:bCs/>
+          <w:lang w:val="es"/>
+        </w:rPr>
+        <w:t xml:space="preserve"> </w:t>
+      </w:r>
+      <w:r>
+        <w:rPr>
+          <w:rStyle w:val="VerbatimChar"/>
+          <w:b/>
+          <w:bCs/>
+          <w:lang w:val="es"/>
+        </w:rPr>
+        <w:t xml:space="preserve">Y</w:t>
+      </w:r>
+      <w:r>
+        <w:rPr>
+          <w:b/>
+          <w:bCs/>
+          <w:lang w:val="es"/>
+        </w:rPr>
+        <w:t xml:space="preserve"> </w:t>
+      </w:r>
+      <w:r>
+        <w:rPr>
+          <w:b/>
+          <w:bCs/>
+          <w:lang w:val="es"/>
+        </w:rPr>
+        <w:t xml:space="preserve">y</w:t>
+      </w:r>
+      <w:r>
+        <w:rPr>
+          <w:b/>
+          <w:bCs/>
+          <w:lang w:val="es"/>
+        </w:rPr>
+        <w:t xml:space="preserve"> </w:t>
+      </w:r>
+      <w:r>
+        <w:rPr>
+          <w:rStyle w:val="VerbatimChar"/>
+          <w:b/>
+          <w:bCs/>
+          <w:lang w:val="es"/>
+        </w:rPr>
+        <w:t xml:space="preserve">B</w:t>
+      </w:r>
+      <w:r>
+        <w:rPr>
+          <w:b/>
+          <w:bCs/>
+          <w:lang w:val="es"/>
+        </w:rPr>
+        <w:t xml:space="preserve"> </w:t>
+      </w:r>
+      <w:r>
+        <w:rPr>
+          <w:b/>
+          <w:bCs/>
+          <w:lang w:val="es"/>
+        </w:rPr>
+        <w:t xml:space="preserve">son físicamente el mismo asiento.</w:t>
+      </w:r>
+      <w:r>
+        <w:rPr>
+          <w:lang w:val="es"/>
+        </w:rPr>
+        <w:t xml:space="preserve"> </w:t>
+      </w:r>
+      <w:r>
+        <w:rPr>
+          <w:lang w:val="es"/>
+        </w:rPr>
+        <w:t xml:space="preserve">Un pasajero en promo y uno en flexible viajan en sillas idénticas, en la misma cabina económica.</w:t>
+      </w:r>
+      <w:r>
+        <w:rPr>
+          <w:lang w:val="es"/>
+        </w:rPr>
+        <w:t xml:space="preserve"> </w:t>
+      </w:r>
+      <w:r>
+        <w:rPr>
+          <w:b/>
+          <w:bCs/>
+          <w:lang w:val="es"/>
+        </w:rPr>
+        <w:t xml:space="preserve">Lo que se cobra distinto no es el asiento: es la flexibilidad.</w:t>
+      </w:r>
+    </w:p>
+    <w:p>
+      <w:pPr>
+        <w:pStyle w:val="FirstParagraph"/>
+      </w:pPr>
+      <w:r>
+        <w:rPr>
+          <w:lang w:val="es"/>
+        </w:rPr>
+        <w:t xml:space="preserve">Lo que realmente cambia entre ellas está en</w:t>
+      </w:r>
+      <w:r>
+        <w:rPr>
+          <w:lang w:val="es"/>
+        </w:rPr>
+        <w:t xml:space="preserve"> </w:t>
+      </w:r>
+      <w:r>
+        <w:rPr>
+          <w:rStyle w:val="VerbatimChar"/>
+          <w:lang w:val="es"/>
+        </w:rPr>
+        <w:t xml:space="preserve">fare_rule</w:t>
+      </w:r>
+      <w:r>
+        <w:rPr>
+          <w:lang w:val="es"/>
+        </w:rPr>
+        <w:t xml:space="preserve">:</w:t>
+      </w:r>
+    </w:p>
+    <w:tbl>
+      <w:tblPr>
+        <w:tblStyle w:val="Table"/>
+        <w:tblW w:type="auto" w:w="0"/>
+        <w:tblLook w:firstRow="1" w:lastRow="0" w:firstColumn="0" w:lastColumn="0" w:noHBand="0" w:noVBand="0" w:val="0020"/>
+      </w:tblPr>
+      <w:tblGrid>
+        <w:gridCol w:w="1320"/>
+        <w:gridCol w:w="1320"/>
+        <w:gridCol w:w="1320"/>
+        <w:gridCol w:w="1320"/>
+        <w:gridCol w:w="1320"/>
+        <w:gridCol w:w="1320"/>
+      </w:tblGrid>
+      <w:tr>
+        <w:trPr>
+          <w:tblHeader w:val="on"/>
+        </w:trPr>
+        <w:tc>
+          <w:tcPr/>
+          <w:p>
+            <w:pPr>
+              <w:pStyle w:val="Compact"/>
+            </w:pPr>
+            <w:r>
+              <w:rPr>
+                <w:lang w:val="es"/>
+              </w:rPr>
+              <w:t xml:space="preserve">Regla</w:t>
+            </w:r>
+          </w:p>
+        </w:tc>
+        <w:tc>
+          <w:tcPr/>
+          <w:p>
+            <w:pPr>
+              <w:pStyle w:val="Compact"/>
+            </w:pPr>
+            <w:r>
+              <w:rPr>
+                <w:lang w:val="es"/>
+              </w:rPr>
+              <w:t xml:space="preserve">Anticipación</w:t>
+            </w:r>
+          </w:p>
+        </w:tc>
+        <w:tc>
+          <w:tcPr/>
+          <w:p>
+            <w:pPr>
+              <w:pStyle w:val="Compact"/>
+            </w:pPr>
+            <w:r>
+              <w:rPr>
+                <w:lang w:val="es"/>
+              </w:rPr>
+              <w:t xml:space="preserve">¿Reembolsable?</w:t>
+            </w:r>
+          </w:p>
+        </w:tc>
+        <w:tc>
+          <w:tcPr/>
+          <w:p>
+            <w:pPr>
+              <w:pStyle w:val="Compact"/>
+            </w:pPr>
+            <w:r>
+              <w:rPr>
+                <w:lang w:val="es"/>
+              </w:rPr>
+              <w:t xml:space="preserve">¿Cambiable?</w:t>
+            </w:r>
+          </w:p>
+        </w:tc>
+        <w:tc>
+          <w:tcPr/>
+          <w:p>
+            <w:pPr>
+              <w:pStyle w:val="Compact"/>
+            </w:pPr>
+            <w:r>
+              <w:rPr>
+                <w:lang w:val="es"/>
+              </w:rPr>
+              <w:t xml:space="preserve">Maletas en bodega</w:t>
+            </w:r>
+          </w:p>
+        </w:tc>
+        <w:tc>
+          <w:tcPr/>
+          <w:p>
+            <w:pPr>
+              <w:pStyle w:val="Compact"/>
+            </w:pPr>
+            <w:r>
+              <w:rPr>
+                <w:lang w:val="es"/>
+              </w:rPr>
+              <w:t xml:space="preserve">¿Silla gratis?</w:t>
+            </w:r>
+          </w:p>
+        </w:tc>
+      </w:tr>
+      <w:tr>
+        <w:tc>
+          <w:tcPr/>
+          <w:p>
+            <w:pPr>
+              <w:pStyle w:val="Compact"/>
+            </w:pPr>
+            <w:r>
+              <w:rPr>
+                <w:lang w:val="es"/>
+              </w:rPr>
+              <w:t xml:space="preserve">Promo anticipada 21d</w:t>
+            </w:r>
+          </w:p>
+        </w:tc>
+        <w:tc>
+          <w:tcPr/>
+          <w:p>
+            <w:pPr>
+              <w:pStyle w:val="Compact"/>
+            </w:pPr>
+            <w:r>
+              <w:rPr>
+                <w:lang w:val="es"/>
+              </w:rPr>
+              <w:t xml:space="preserve">21 días</w:t>
+            </w:r>
+          </w:p>
+        </w:tc>
+        <w:tc>
+          <w:tcPr/>
+          <w:p>
+            <w:pPr>
+              <w:pStyle w:val="Compact"/>
+            </w:pPr>
+            <w:r>
+              <w:rPr>
+                <w:lang w:val="es"/>
+              </w:rPr>
+              <w:t xml:space="preserve">No</w:t>
+            </w:r>
+          </w:p>
+        </w:tc>
+        <w:tc>
+          <w:tcPr/>
+          <w:p>
+            <w:pPr>
+              <w:pStyle w:val="Compact"/>
+            </w:pPr>
+            <w:r>
+              <w:rPr>
+                <w:lang w:val="es"/>
+              </w:rPr>
+              <w:t xml:space="preserve">No</w:t>
+            </w:r>
+          </w:p>
+        </w:tc>
+        <w:tc>
+          <w:tcPr/>
+          <w:p>
+            <w:pPr>
+              <w:pStyle w:val="Compact"/>
+            </w:pPr>
+            <w:r>
+              <w:rPr>
+                <w:lang w:val="es"/>
+              </w:rPr>
+              <w:t xml:space="preserve">0</w:t>
+            </w:r>
+          </w:p>
+        </w:tc>
+        <w:tc>
+          <w:tcPr/>
+          <w:p>
+            <w:pPr>
+              <w:pStyle w:val="Compact"/>
+            </w:pPr>
+            <w:r>
+              <w:rPr>
+                <w:lang w:val="es"/>
+              </w:rPr>
+              <w:t xml:space="preserve">No</w:t>
+            </w:r>
+          </w:p>
+        </w:tc>
+      </w:tr>
+      <w:tr>
+        <w:tc>
+          <w:tcPr/>
+          <w:p>
+            <w:pPr>
+              <w:pStyle w:val="Compact"/>
+            </w:pPr>
+            <w:r>
+              <w:rPr>
+                <w:lang w:val="es"/>
+              </w:rPr>
+              <w:t xml:space="preserve">Estándar 7d</w:t>
+            </w:r>
+          </w:p>
+        </w:tc>
+        <w:tc>
+          <w:tcPr/>
+          <w:p>
+            <w:pPr>
+              <w:pStyle w:val="Compact"/>
+            </w:pPr>
+            <w:r>
+              <w:rPr>
+                <w:lang w:val="es"/>
+              </w:rPr>
+              <w:t xml:space="preserve">7 días</w:t>
+            </w:r>
+          </w:p>
+        </w:tc>
+        <w:tc>
+          <w:tcPr/>
+          <w:p>
+            <w:pPr>
+              <w:pStyle w:val="Compact"/>
+            </w:pPr>
+            <w:r>
+              <w:rPr>
+                <w:lang w:val="es"/>
+              </w:rPr>
+              <w:t xml:space="preserve">No</w:t>
+            </w:r>
+          </w:p>
+        </w:tc>
+        <w:tc>
+          <w:tcPr/>
+          <w:p>
+            <w:pPr>
+              <w:pStyle w:val="Compact"/>
+            </w:pPr>
+            <w:r>
+              <w:rPr>
+                <w:lang w:val="es"/>
+              </w:rPr>
+              <w:t xml:space="preserve">Sí, con penalidad de 120.000</w:t>
+            </w:r>
+          </w:p>
+        </w:tc>
+        <w:tc>
+          <w:tcPr/>
+          <w:p>
+            <w:pPr>
+              <w:pStyle w:val="Compact"/>
+            </w:pPr>
+            <w:r>
+              <w:rPr>
+                <w:lang w:val="es"/>
+              </w:rPr>
+              <w:t xml:space="preserve">1</w:t>
+            </w:r>
+          </w:p>
+        </w:tc>
+        <w:tc>
+          <w:tcPr/>
+          <w:p>
+            <w:pPr>
+              <w:pStyle w:val="Compact"/>
+            </w:pPr>
+            <w:r>
+              <w:rPr>
+                <w:lang w:val="es"/>
+              </w:rPr>
+              <w:t xml:space="preserve">No</w:t>
+            </w:r>
+          </w:p>
+        </w:tc>
+      </w:tr>
+      <w:tr>
+        <w:tc>
+          <w:tcPr/>
+          <w:p>
+            <w:pPr>
+              <w:pStyle w:val="Compact"/>
+            </w:pPr>
+            <w:r>
+              <w:rPr>
+                <w:lang w:val="es"/>
+              </w:rPr>
+              <w:t xml:space="preserve">Flexible</w:t>
+            </w:r>
+          </w:p>
+        </w:tc>
+        <w:tc>
+          <w:tcPr/>
+          <w:p>
+            <w:pPr>
+              <w:pStyle w:val="Compact"/>
+            </w:pPr>
+            <w:r>
+              <w:rPr>
+                <w:lang w:val="es"/>
+              </w:rPr>
+              <w:t xml:space="preserve">0 días</w:t>
+            </w:r>
+          </w:p>
+        </w:tc>
+        <w:tc>
+          <w:tcPr/>
+          <w:p>
+            <w:pPr>
+              <w:pStyle w:val="Compact"/>
+            </w:pPr>
+            <w:r>
+              <w:rPr>
+                <w:lang w:val="es"/>
+              </w:rPr>
+              <w:t xml:space="preserve">Sí, con penalidad de 180.000</w:t>
+            </w:r>
+          </w:p>
+        </w:tc>
+        <w:tc>
+          <w:tcPr/>
+          <w:p>
+            <w:pPr>
+              <w:pStyle w:val="Compact"/>
+            </w:pPr>
+            <w:r>
+              <w:rPr>
+                <w:lang w:val="es"/>
+              </w:rPr>
+              <w:t xml:space="preserve">Sí, sin penalidad</w:t>
+            </w:r>
+          </w:p>
+        </w:tc>
+        <w:tc>
+          <w:tcPr/>
+          <w:p>
+            <w:pPr>
+              <w:pStyle w:val="Compact"/>
+            </w:pPr>
+            <w:r>
+              <w:rPr>
+                <w:lang w:val="es"/>
+              </w:rPr>
+              <w:t xml:space="preserve">1</w:t>
+            </w:r>
+          </w:p>
+        </w:tc>
+        <w:tc>
+          <w:tcPr/>
+          <w:p>
+            <w:pPr>
+              <w:pStyle w:val="Compact"/>
+            </w:pPr>
+            <w:r>
+              <w:rPr>
+                <w:lang w:val="es"/>
+              </w:rPr>
+              <w:t xml:space="preserve">Sí</w:t>
+            </w:r>
+          </w:p>
+        </w:tc>
+      </w:tr>
+      <w:tr>
+        <w:tc>
+          <w:tcPr/>
+          <w:p>
+            <w:pPr>
+              <w:pStyle w:val="Compact"/>
+            </w:pPr>
+            <w:r>
+              <w:rPr>
+                <w:lang w:val="es"/>
+              </w:rPr>
+              <w:t xml:space="preserve">Ejecutiva flexible</w:t>
+            </w:r>
+          </w:p>
+        </w:tc>
+        <w:tc>
+          <w:tcPr/>
+          <w:p>
+            <w:pPr>
+              <w:pStyle w:val="Compact"/>
+            </w:pPr>
+            <w:r>
+              <w:rPr>
+                <w:lang w:val="es"/>
+              </w:rPr>
+              <w:t xml:space="preserve">0 días</w:t>
+            </w:r>
+          </w:p>
+        </w:tc>
+        <w:tc>
+          <w:tcPr/>
+          <w:p>
+            <w:pPr>
+              <w:pStyle w:val="Compact"/>
+            </w:pPr>
+            <w:r>
+              <w:rPr>
+                <w:lang w:val="es"/>
+              </w:rPr>
+              <w:t xml:space="preserve">Sí, sin penalidad</w:t>
+            </w:r>
+          </w:p>
+        </w:tc>
+        <w:tc>
+          <w:tcPr/>
+          <w:p>
+            <w:pPr>
+              <w:pStyle w:val="Compact"/>
+            </w:pPr>
+            <w:r>
+              <w:rPr>
+                <w:lang w:val="es"/>
+              </w:rPr>
+              <w:t xml:space="preserve">Sí, sin penalidad</w:t>
+            </w:r>
+          </w:p>
+        </w:tc>
+        <w:tc>
+          <w:tcPr/>
+          <w:p>
+            <w:pPr>
+              <w:pStyle w:val="Compact"/>
+            </w:pPr>
+            <w:r>
+              <w:rPr>
+                <w:lang w:val="es"/>
+              </w:rPr>
+              <w:t xml:space="preserve">2</w:t>
+            </w:r>
+          </w:p>
+        </w:tc>
+        <w:tc>
+          <w:tcPr/>
+          <w:p>
+            <w:pPr>
+              <w:pStyle w:val="Compact"/>
+            </w:pPr>
+            <w:r>
+              <w:rPr>
+                <w:lang w:val="es"/>
+              </w:rPr>
+              <w:t xml:space="preserve">Sí</w:t>
+            </w:r>
+          </w:p>
+        </w:tc>
+      </w:tr>
+    </w:tbl>
+    <w:p>
+      <w:pPr>
+        <w:pStyle w:val="BodyText"/>
+      </w:pPr>
+      <w:r>
+        <w:rPr>
+          <w:b/>
+          <w:bCs/>
+          <w:lang w:val="es"/>
+        </w:rPr>
+        <w:t xml:space="preserve">La lógica comercial que explica el orden</w:t>
+      </w:r>
+      <w:r>
+        <w:rPr>
+          <w:lang w:val="es"/>
+        </w:rPr>
+        <w:t xml:space="preserve">, y que es lo que hay que poder sustentar: la aerolínea quiere vender barato y temprano (llena el avión con anticipación y cobra por adelantado), y caro y tarde (al viajero de negocios que decide a última hora y paga por poder cambiar de planes). El</w:t>
+      </w:r>
+      <w:r>
+        <w:rPr>
+          <w:lang w:val="es"/>
+        </w:rPr>
+        <w:t xml:space="preserve"> </w:t>
+      </w:r>
+      <w:r>
+        <w:rPr>
+          <w:rStyle w:val="VerbatimChar"/>
+          <w:lang w:val="es"/>
+        </w:rPr>
+        <w:t xml:space="preserve">rank</w:t>
+      </w:r>
+      <w:r>
+        <w:rPr>
+          <w:lang w:val="es"/>
+        </w:rPr>
+        <w:t xml:space="preserve"> </w:t>
+      </w:r>
+      <w:r>
+        <w:rPr>
+          <w:lang w:val="es"/>
+        </w:rPr>
+        <w:t xml:space="preserve">codifica esa escalera. Por eso</w:t>
+      </w:r>
+      <w:r>
+        <w:rPr>
+          <w:lang w:val="es"/>
+        </w:rPr>
+        <w:t xml:space="preserve"> </w:t>
+      </w:r>
+      <w:r>
+        <w:rPr>
+          <w:rStyle w:val="VerbatimChar"/>
+          <w:lang w:val="es"/>
+        </w:rPr>
+        <w:t xml:space="preserve">min_advance_days</w:t>
+      </w:r>
+      <w:r>
+        <w:rPr>
+          <w:lang w:val="es"/>
+        </w:rPr>
+        <w:t xml:space="preserve"> </w:t>
+      </w:r>
+      <w:r>
+        <w:rPr>
+          <w:b/>
+          <w:bCs/>
+          <w:lang w:val="es"/>
+        </w:rPr>
+        <w:t xml:space="preserve">decrece</w:t>
+      </w:r>
+      <w:r>
+        <w:rPr>
+          <w:lang w:val="es"/>
+        </w:rPr>
+        <w:t xml:space="preserve"> </w:t>
+      </w:r>
+      <w:r>
+        <w:rPr>
+          <w:lang w:val="es"/>
+        </w:rPr>
+        <w:t xml:space="preserve">al subir de rango: la promo exige comprar con 21 días de anticipación precisamente porque su función es capturar demanda temprana; la flexible no exige nada porque su función es capturar al que compra hoy para volar mañana.</w:t>
+      </w:r>
+    </w:p>
+    <w:p>
+      <w:pPr>
+        <w:pStyle w:val="BodyText"/>
+      </w:pPr>
+      <w:r>
+        <w:rPr>
+          <w:b/>
+          <w:bCs/>
+          <w:lang w:val="es"/>
+        </w:rPr>
+        <w:t xml:space="preserve">Y esto se puede comprobar en los datos, no solo afirmar.</w:t>
+      </w:r>
+      <w:r>
+        <w:rPr>
+          <w:lang w:val="es"/>
+        </w:rPr>
+        <w:t xml:space="preserve"> </w:t>
+      </w:r>
+      <w:r>
+        <w:rPr>
+          <w:lang w:val="es"/>
+        </w:rPr>
+        <w:t xml:space="preserve">En la corrida real del ETL, la anticipación media de compra por clase salió en el orden esperado:</w:t>
+      </w:r>
+    </w:p>
+    <w:tbl>
+      <w:tblPr>
+        <w:tblStyle w:val="Table"/>
+        <w:tblW w:type="auto" w:w="0"/>
+        <w:tblLook w:firstRow="1" w:lastRow="0" w:firstColumn="0" w:lastColumn="0" w:noHBand="0" w:noVBand="0" w:val="0020"/>
+      </w:tblPr>
+      <w:tblGrid>
+        <w:gridCol w:w="2640"/>
+        <w:gridCol w:w="2640"/>
+        <w:gridCol w:w="2640"/>
+      </w:tblGrid>
+      <w:tr>
+        <w:trPr>
+          <w:tblHeader w:val="on"/>
+        </w:trPr>
+        <w:tc>
+          <w:tcPr/>
+          <w:p>
+            <w:pPr>
+              <w:pStyle w:val="Compact"/>
+            </w:pPr>
+            <w:r>
+              <w:rPr>
+                <w:lang w:val="es"/>
+              </w:rPr>
+              <w:t xml:space="preserve">Clase</w:t>
+            </w:r>
+          </w:p>
+        </w:tc>
+        <w:tc>
+          <w:tcPr/>
+          <w:p>
+            <w:pPr>
+              <w:pStyle w:val="Compact"/>
+            </w:pPr>
+            <w:r>
+              <w:rPr>
+                <w:lang w:val="es"/>
+              </w:rPr>
+              <w:t xml:space="preserve">Anticipación mínima exigida</w:t>
+            </w:r>
+          </w:p>
+        </w:tc>
+        <w:tc>
+          <w:tcPr/>
+          <w:p>
+            <w:pPr>
+              <w:pStyle w:val="Compact"/>
+            </w:pPr>
+            <w:r>
+              <w:rPr>
+                <w:lang w:val="es"/>
+              </w:rPr>
+              <w:t xml:space="preserve">Anticipación media</w:t>
+            </w:r>
+            <w:r>
+              <w:rPr>
+                <w:lang w:val="es"/>
+              </w:rPr>
+              <w:t xml:space="preserve"> </w:t>
+            </w:r>
+            <w:r>
+              <w:rPr>
+                <w:b/>
+                <w:bCs/>
+                <w:lang w:val="es"/>
+              </w:rPr>
+              <w:t xml:space="preserve">real</w:t>
+            </w:r>
+            <w:r>
+              <w:rPr>
+                <w:lang w:val="es"/>
+              </w:rPr>
+              <w:t xml:space="preserve"> </w:t>
+            </w:r>
+            <w:r>
+              <w:rPr>
+                <w:lang w:val="es"/>
+              </w:rPr>
+              <w:t xml:space="preserve">de compra</w:t>
+            </w:r>
+          </w:p>
+        </w:tc>
+      </w:tr>
+      <w:tr>
+        <w:tc>
+          <w:tcPr/>
+          <w:p>
+            <w:pPr>
+              <w:pStyle w:val="Compact"/>
+            </w:pPr>
+            <w:r>
+              <w:rPr>
+                <w:rStyle w:val="VerbatimChar"/>
+                <w:lang w:val="es"/>
+              </w:rPr>
+              <w:t xml:space="preserve">P</w:t>
+            </w:r>
+            <w:r>
+              <w:rPr>
+                <w:lang w:val="es"/>
+              </w:rPr>
+              <w:t xml:space="preserve"> </w:t>
+            </w:r>
+            <w:r>
+              <w:rPr>
+                <w:lang w:val="es"/>
+              </w:rPr>
+              <w:t xml:space="preserve">promo</w:t>
+            </w:r>
+          </w:p>
+        </w:tc>
+        <w:tc>
+          <w:tcPr/>
+          <w:p>
+            <w:pPr>
+              <w:pStyle w:val="Compact"/>
+            </w:pPr>
+            <w:r>
+              <w:rPr>
+                <w:lang w:val="es"/>
+              </w:rPr>
+              <w:t xml:space="preserve">21 días</w:t>
+            </w:r>
+          </w:p>
+        </w:tc>
+        <w:tc>
+          <w:tcPr/>
+          <w:p>
+            <w:pPr>
+              <w:pStyle w:val="Compact"/>
+            </w:pPr>
+            <w:r>
+              <w:rPr>
+                <w:b/>
+                <w:bCs/>
+                <w:lang w:val="es"/>
+              </w:rPr>
+              <w:t xml:space="preserve">38,1 días</w:t>
+            </w:r>
+          </w:p>
+        </w:tc>
+      </w:tr>
+      <w:tr>
+        <w:tc>
+          <w:tcPr/>
+          <w:p>
+            <w:pPr>
+              <w:pStyle w:val="Compact"/>
+            </w:pPr>
+            <w:r>
+              <w:rPr>
+                <w:rStyle w:val="VerbatimChar"/>
+                <w:lang w:val="es"/>
+              </w:rPr>
+              <w:t xml:space="preserve">Y</w:t>
+            </w:r>
+            <w:r>
+              <w:rPr>
+                <w:lang w:val="es"/>
+              </w:rPr>
+              <w:t xml:space="preserve"> </w:t>
+            </w:r>
+            <w:r>
+              <w:rPr>
+                <w:lang w:val="es"/>
+              </w:rPr>
+              <w:t xml:space="preserve">estándar</w:t>
+            </w:r>
+          </w:p>
+        </w:tc>
+        <w:tc>
+          <w:tcPr/>
+          <w:p>
+            <w:pPr>
+              <w:pStyle w:val="Compact"/>
+            </w:pPr>
+            <w:r>
+              <w:rPr>
+                <w:lang w:val="es"/>
+              </w:rPr>
+              <w:t xml:space="preserve">7 días</w:t>
+            </w:r>
+          </w:p>
+        </w:tc>
+        <w:tc>
+          <w:tcPr/>
+          <w:p>
+            <w:pPr>
+              <w:pStyle w:val="Compact"/>
+            </w:pPr>
+            <w:r>
+              <w:rPr>
+                <w:b/>
+                <w:bCs/>
+                <w:lang w:val="es"/>
+              </w:rPr>
+              <w:t xml:space="preserve">16,3 días</w:t>
+            </w:r>
+          </w:p>
+        </w:tc>
+      </w:tr>
+      <w:tr>
+        <w:tc>
+          <w:tcPr/>
+          <w:p>
+            <w:pPr>
+              <w:pStyle w:val="Compact"/>
+            </w:pPr>
+            <w:r>
+              <w:rPr>
+                <w:rStyle w:val="VerbatimChar"/>
+                <w:lang w:val="es"/>
+              </w:rPr>
+              <w:t xml:space="preserve">B</w:t>
+            </w:r>
+            <w:r>
+              <w:rPr>
+                <w:lang w:val="es"/>
+              </w:rPr>
+              <w:t xml:space="preserve"> </w:t>
+            </w:r>
+            <w:r>
+              <w:rPr>
+                <w:lang w:val="es"/>
+              </w:rPr>
+              <w:t xml:space="preserve">flexible</w:t>
+            </w:r>
+          </w:p>
+        </w:tc>
+        <w:tc>
+          <w:tcPr/>
+          <w:p>
+            <w:pPr>
+              <w:pStyle w:val="Compact"/>
+            </w:pPr>
+            <w:r>
+              <w:rPr>
+                <w:lang w:val="es"/>
+              </w:rPr>
+              <w:t xml:space="preserve">0 días</w:t>
+            </w:r>
+          </w:p>
+        </w:tc>
+        <w:tc>
+          <w:tcPr/>
+          <w:p>
+            <w:pPr>
+              <w:pStyle w:val="Compact"/>
+            </w:pPr>
+            <w:r>
+              <w:rPr>
+                <w:b/>
+                <w:bCs/>
+                <w:lang w:val="es"/>
+              </w:rPr>
+              <w:t xml:space="preserve">3,4 días</w:t>
+            </w:r>
+          </w:p>
+        </w:tc>
+      </w:tr>
+    </w:tbl>
+    <w:p>
+      <w:pPr>
+        <w:pStyle w:val="BodyText"/>
+      </w:pPr>
+      <w:r>
+        <w:rPr>
+          <w:lang w:val="es"/>
+        </w:rPr>
+        <w:t xml:space="preserve">La regla no solo está en el esquema:</w:t>
+      </w:r>
+      <w:r>
+        <w:rPr>
+          <w:lang w:val="es"/>
+        </w:rPr>
+        <w:t xml:space="preserve"> </w:t>
+      </w:r>
+      <w:r>
+        <w:rPr>
+          <w:b/>
+          <w:bCs/>
+          <w:lang w:val="es"/>
+        </w:rPr>
+        <w:t xml:space="preserve">se comporta como debe en los datos</w:t>
+      </w:r>
+      <w:r>
+        <w:rPr>
+          <w:lang w:val="es"/>
+        </w:rPr>
+        <w:t xml:space="preserve">. Es una de las verificaciones más contundentes del trabajo, porque demuestra que el modelo de tarifas no es decorativo.</w:t>
+      </w:r>
+    </w:p>
+    <w:p>
+      <w:pPr>
+        <w:pStyle w:val="BlockText"/>
+      </w:pPr>
+      <w:r>
+        <w:rPr>
+          <w:b/>
+          <w:bCs/>
+          <w:lang w:val="es"/>
+        </w:rPr>
+        <w:t xml:space="preserve">Cómo se elige la clase al reservar:</w:t>
+      </w:r>
+      <w:r>
+        <w:rPr>
+          <w:lang w:val="es"/>
+        </w:rPr>
+        <w:t xml:space="preserve"> </w:t>
+      </w:r>
+      <w:r>
+        <w:rPr>
+          <w:lang w:val="es"/>
+        </w:rPr>
+        <w:t xml:space="preserve">el sistema no la pide, la</w:t>
+      </w:r>
+      <w:r>
+        <w:rPr>
+          <w:lang w:val="es"/>
+        </w:rPr>
+        <w:t xml:space="preserve"> </w:t>
+      </w:r>
+      <w:r>
+        <w:rPr>
+          <w:b/>
+          <w:bCs/>
+          <w:lang w:val="es"/>
+        </w:rPr>
+        <w:t xml:space="preserve">deriva</w:t>
+      </w:r>
+      <w:r>
+        <w:rPr>
+          <w:lang w:val="es"/>
+        </w:rPr>
+        <w:t xml:space="preserve">.</w:t>
+      </w:r>
+      <w:r>
+        <w:rPr>
+          <w:lang w:val="es"/>
+        </w:rPr>
+        <w:t xml:space="preserve"> </w:t>
+      </w:r>
+      <w:r>
+        <w:rPr>
+          <w:rStyle w:val="VerbatimChar"/>
+          <w:lang w:val="es"/>
+        </w:rPr>
+        <w:t xml:space="preserve">search.py</w:t>
+      </w:r>
+      <w:r>
+        <w:rPr>
+          <w:lang w:val="es"/>
+        </w:rPr>
+        <w:t xml:space="preserve"> </w:t>
+      </w:r>
+      <w:r>
+        <w:rPr>
+          <w:lang w:val="es"/>
+        </w:rPr>
+        <w:t xml:space="preserve">y</w:t>
+      </w:r>
+      <w:r>
+        <w:rPr>
+          <w:lang w:val="es"/>
+        </w:rPr>
+        <w:t xml:space="preserve"> </w:t>
+      </w:r>
+      <w:r>
+        <w:rPr>
+          <w:rStyle w:val="VerbatimChar"/>
+          <w:lang w:val="es"/>
+        </w:rPr>
+        <w:t xml:space="preserve">booking.py</w:t>
+      </w:r>
+      <w:r>
+        <w:rPr>
+          <w:lang w:val="es"/>
+        </w:rPr>
+        <w:t xml:space="preserve"> </w:t>
+      </w:r>
+      <w:r>
+        <w:rPr>
+          <w:lang w:val="es"/>
+        </w:rPr>
+        <w:t xml:space="preserve">consultan la tarifa más barata</w:t>
+      </w:r>
+      <w:r>
+        <w:rPr>
+          <w:lang w:val="es"/>
+        </w:rPr>
+        <w:t xml:space="preserve"> </w:t>
+      </w:r>
+      <w:r>
+        <w:rPr>
+          <w:i/>
+          <w:iCs/>
+          <w:lang w:val="es"/>
+        </w:rPr>
+        <w:t xml:space="preserve">elegible</w:t>
+      </w:r>
+      <w:r>
+        <w:rPr>
+          <w:lang w:val="es"/>
+        </w:rPr>
+        <w:t xml:space="preserve"> </w:t>
+      </w:r>
+      <w:r>
+        <w:rPr>
+          <w:lang w:val="es"/>
+        </w:rPr>
+        <w:t xml:space="preserve">para la fecha del vuelo, y la elegibilidad la impone</w:t>
+      </w:r>
+      <w:r>
+        <w:rPr>
+          <w:lang w:val="es"/>
+        </w:rPr>
+        <w:t xml:space="preserve"> </w:t>
+      </w:r>
+      <w:r>
+        <w:rPr>
+          <w:rStyle w:val="VerbatimChar"/>
+          <w:lang w:val="es"/>
+        </w:rPr>
+        <w:t xml:space="preserve">fare_rule.min_advance_days &lt;= (fecha_del_vuelo - hoy)</w:t>
+      </w:r>
+      <w:r>
+        <w:rPr>
+          <w:lang w:val="es"/>
+        </w:rPr>
+        <w:t xml:space="preserve">. Si faltan 30 días,</w:t>
+      </w:r>
+      <w:r>
+        <w:rPr>
+          <w:lang w:val="es"/>
+        </w:rPr>
+        <w:t xml:space="preserve"> </w:t>
+      </w:r>
+      <w:r>
+        <w:rPr>
+          <w:rStyle w:val="VerbatimChar"/>
+          <w:lang w:val="es"/>
+        </w:rPr>
+        <w:t xml:space="preserve">P</w:t>
+      </w:r>
+      <w:r>
+        <w:rPr>
+          <w:lang w:val="es"/>
+        </w:rPr>
+        <w:t xml:space="preserve"> </w:t>
+      </w:r>
+      <w:r>
+        <w:rPr>
+          <w:lang w:val="es"/>
+        </w:rPr>
+        <w:t xml:space="preserve">es elegible y gana por precio; si faltan 3,</w:t>
+      </w:r>
+      <w:r>
+        <w:rPr>
+          <w:lang w:val="es"/>
+        </w:rPr>
+        <w:t xml:space="preserve"> </w:t>
+      </w:r>
+      <w:r>
+        <w:rPr>
+          <w:rStyle w:val="VerbatimChar"/>
+          <w:lang w:val="es"/>
+        </w:rPr>
+        <w:t xml:space="preserve">P</w:t>
+      </w:r>
+      <w:r>
+        <w:rPr>
+          <w:lang w:val="es"/>
+        </w:rPr>
+        <w:t xml:space="preserve"> </w:t>
+      </w:r>
+      <w:r>
+        <w:rPr>
+          <w:lang w:val="es"/>
+        </w:rPr>
+        <w:t xml:space="preserve">queda descartada automáticamente y el pasajero paga</w:t>
+      </w:r>
+      <w:r>
+        <w:rPr>
+          <w:lang w:val="es"/>
+        </w:rPr>
+        <w:t xml:space="preserve"> </w:t>
+      </w:r>
+      <w:r>
+        <w:rPr>
+          <w:rStyle w:val="VerbatimChar"/>
+          <w:lang w:val="es"/>
+        </w:rPr>
+        <w:t xml:space="preserve">B</w:t>
+      </w:r>
+      <w:r>
+        <w:rPr>
+          <w:lang w:val="es"/>
+        </w:rPr>
+        <w:t xml:space="preserve">. Esa es la implementación literal de</w:t>
+      </w:r>
+      <w:r>
+        <w:rPr>
+          <w:lang w:val="es"/>
+        </w:rPr>
+        <w:t xml:space="preserve"> </w:t>
+      </w:r>
+      <w:r>
+        <w:rPr>
+          <w:i/>
+          <w:iCs/>
+          <w:lang w:val="es"/>
+        </w:rPr>
+        <w:t xml:space="preserve">"tarifas diferentes según la anticipación con que se compra el tiquete"</w:t>
+      </w:r>
+      <w:r>
+        <w:rPr>
+          <w:lang w:val="es"/>
+        </w:rPr>
+        <w:t xml:space="preserve"> </w:t>
+      </w:r>
+      <w:r>
+        <w:rPr>
+          <w:lang w:val="es"/>
+        </w:rPr>
+        <w:t xml:space="preserve">que pide el enunciado.</w:t>
+      </w:r>
+    </w:p>
+    <w:p>
+      <w:r>
+        <w:pict>
+          <v:rect style="width:0;height:1.5pt" o:hralign="center" o:hrstd="t" o:hr="t"/>
+        </w:pict>
       </w:r>
     </w:p>
     <w:bookmarkEnd w:id="33"/>
     <w:bookmarkEnd w:id="34"/>
+    <w:bookmarkStart w:id="35" w:name="Xe68489c82c1e875690a31689eba83ad54d9452d"/>
+    <w:p>
+      <w:pPr>
+        <w:pStyle w:val="Heading3"/>
+      </w:pPr>
+      <w:r>
+        <w:rPr>
+          <w:lang w:val="es"/>
+        </w:rPr>
+        <w:t xml:space="preserve">5.8 Por qué las tablas están en ese orden en el esquema</w:t>
+      </w:r>
+    </w:p>
+    <w:p>
+      <w:pPr>
+        <w:pStyle w:val="FirstParagraph"/>
+      </w:pPr>
+      <w:r>
+        <w:rPr>
+          <w:lang w:val="es"/>
+        </w:rPr>
+        <w:t xml:space="preserve">El archivo</w:t>
+      </w:r>
+      <w:r>
+        <w:rPr>
+          <w:lang w:val="es"/>
+        </w:rPr>
+        <w:t xml:space="preserve"> </w:t>
+      </w:r>
+      <w:r>
+        <w:rPr>
+          <w:rStyle w:val="VerbatimChar"/>
+          <w:lang w:val="es"/>
+        </w:rPr>
+        <w:t xml:space="preserve">backend/sql/01_schema.sql</w:t>
+      </w:r>
+      <w:r>
+        <w:rPr>
+          <w:lang w:val="es"/>
+        </w:rPr>
+        <w:t xml:space="preserve"> </w:t>
+      </w:r>
+      <w:r>
+        <w:rPr>
+          <w:lang w:val="es"/>
+        </w:rPr>
+        <w:t xml:space="preserve">está dividido en</w:t>
+      </w:r>
+      <w:r>
+        <w:rPr>
+          <w:lang w:val="es"/>
+        </w:rPr>
+        <w:t xml:space="preserve"> </w:t>
+      </w:r>
+      <w:r>
+        <w:rPr>
+          <w:b/>
+          <w:bCs/>
+          <w:lang w:val="es"/>
+        </w:rPr>
+        <w:t xml:space="preserve">nueve bloques numerados</w:t>
+      </w:r>
+      <w:r>
+        <w:rPr>
+          <w:lang w:val="es"/>
+        </w:rPr>
+        <w:t xml:space="preserve">, y el orden</w:t>
+      </w:r>
+      <w:r>
+        <w:rPr>
+          <w:lang w:val="es"/>
+        </w:rPr>
+        <w:t xml:space="preserve"> </w:t>
+      </w:r>
+      <w:r>
+        <w:rPr>
+          <w:b/>
+          <w:bCs/>
+          <w:lang w:val="es"/>
+        </w:rPr>
+        <w:t xml:space="preserve">no es estético: es obligatorio y además significativo</w:t>
+      </w:r>
+      <w:r>
+        <w:rPr>
+          <w:lang w:val="es"/>
+        </w:rPr>
+        <w:t xml:space="preserve">.</w:t>
+      </w:r>
+    </w:p>
+    <w:tbl>
+      <w:tblPr>
+        <w:tblStyle w:val="Table"/>
+        <w:tblW w:type="auto" w:w="0"/>
+        <w:tblLook w:firstRow="1" w:lastRow="0" w:firstColumn="0" w:lastColumn="0" w:noHBand="0" w:noVBand="0" w:val="0020"/>
+      </w:tblPr>
+      <w:tblGrid>
+        <w:gridCol w:w="2640"/>
+        <w:gridCol w:w="2640"/>
+        <w:gridCol w:w="2640"/>
+      </w:tblGrid>
+      <w:tr>
+        <w:trPr>
+          <w:tblHeader w:val="on"/>
+        </w:trPr>
+        <w:tc>
+          <w:tcPr/>
+          <w:p>
+            <w:pPr>
+              <w:pStyle w:val="Compact"/>
+            </w:pPr>
+            <w:r>
+              <w:rPr>
+                <w:lang w:val="es"/>
+              </w:rPr>
+              <w:t xml:space="preserve">#</w:t>
+            </w:r>
+          </w:p>
+        </w:tc>
+        <w:tc>
+          <w:tcPr/>
+          <w:p>
+            <w:pPr>
+              <w:pStyle w:val="Compact"/>
+            </w:pPr>
+            <w:r>
+              <w:rPr>
+                <w:lang w:val="es"/>
+              </w:rPr>
+              <w:t xml:space="preserve">Bloque</w:t>
+            </w:r>
+          </w:p>
+        </w:tc>
+        <w:tc>
+          <w:tcPr/>
+          <w:p>
+            <w:pPr>
+              <w:pStyle w:val="Compact"/>
+            </w:pPr>
+            <w:r>
+              <w:rPr>
+                <w:lang w:val="es"/>
+              </w:rPr>
+              <w:t xml:space="preserve">Tablas</w:t>
+            </w:r>
+          </w:p>
+        </w:tc>
+      </w:tr>
+      <w:tr>
+        <w:tc>
+          <w:tcPr/>
+          <w:p>
+            <w:pPr>
+              <w:pStyle w:val="Compact"/>
+            </w:pPr>
+            <w:r>
+              <w:rPr>
+                <w:lang w:val="es"/>
+              </w:rPr>
+              <w:t xml:space="preserve">1</w:t>
+            </w:r>
+          </w:p>
+        </w:tc>
+        <w:tc>
+          <w:tcPr/>
+          <w:p>
+            <w:pPr>
+              <w:pStyle w:val="Compact"/>
+            </w:pPr>
+            <w:r>
+              <w:rPr>
+                <w:lang w:val="es"/>
+              </w:rPr>
+              <w:t xml:space="preserve">Catálogo de red y flota</w:t>
+            </w:r>
+          </w:p>
+        </w:tc>
+        <w:tc>
+          <w:tcPr/>
+          <w:p>
+            <w:pPr>
+              <w:pStyle w:val="Compact"/>
+            </w:pPr>
+            <w:r>
+              <w:rPr>
+                <w:rStyle w:val="VerbatimChar"/>
+                <w:lang w:val="es"/>
+              </w:rPr>
+              <w:t xml:space="preserve">cabin</w:t>
+            </w:r>
+            <w:r>
+              <w:rPr>
+                <w:lang w:val="es"/>
+              </w:rPr>
+              <w:t xml:space="preserve">,</w:t>
+            </w:r>
+            <w:r>
+              <w:rPr>
+                <w:lang w:val="es"/>
+              </w:rPr>
+              <w:t xml:space="preserve"> </w:t>
+            </w:r>
+            <w:r>
+              <w:rPr>
+                <w:rStyle w:val="VerbatimChar"/>
+                <w:lang w:val="es"/>
+              </w:rPr>
+              <w:t xml:space="preserve">airport</w:t>
+            </w:r>
+            <w:r>
+              <w:rPr>
+                <w:lang w:val="es"/>
+              </w:rPr>
+              <w:t xml:space="preserve">,</w:t>
+            </w:r>
+            <w:r>
+              <w:rPr>
+                <w:lang w:val="es"/>
+              </w:rPr>
+              <w:t xml:space="preserve"> </w:t>
+            </w:r>
+            <w:r>
+              <w:rPr>
+                <w:rStyle w:val="VerbatimChar"/>
+                <w:lang w:val="es"/>
+              </w:rPr>
+              <w:t xml:space="preserve">route</w:t>
+            </w:r>
+            <w:r>
+              <w:rPr>
+                <w:lang w:val="es"/>
+              </w:rPr>
+              <w:t xml:space="preserve">,</w:t>
+            </w:r>
+            <w:r>
+              <w:rPr>
+                <w:lang w:val="es"/>
+              </w:rPr>
+              <w:t xml:space="preserve"> </w:t>
+            </w:r>
+            <w:r>
+              <w:rPr>
+                <w:rStyle w:val="VerbatimChar"/>
+                <w:lang w:val="es"/>
+              </w:rPr>
+              <w:t xml:space="preserve">aircraft_model</w:t>
+            </w:r>
+            <w:r>
+              <w:rPr>
+                <w:lang w:val="es"/>
+              </w:rPr>
+              <w:t xml:space="preserve">,</w:t>
+            </w:r>
+            <w:r>
+              <w:rPr>
+                <w:lang w:val="es"/>
+              </w:rPr>
+              <w:t xml:space="preserve"> </w:t>
+            </w:r>
+            <w:r>
+              <w:rPr>
+                <w:rStyle w:val="VerbatimChar"/>
+                <w:lang w:val="es"/>
+              </w:rPr>
+              <w:t xml:space="preserve">seat_map</w:t>
+            </w:r>
+            <w:r>
+              <w:rPr>
+                <w:lang w:val="es"/>
+              </w:rPr>
+              <w:t xml:space="preserve">,</w:t>
+            </w:r>
+            <w:r>
+              <w:rPr>
+                <w:lang w:val="es"/>
+              </w:rPr>
+              <w:t xml:space="preserve"> </w:t>
+            </w:r>
+            <w:r>
+              <w:rPr>
+                <w:rStyle w:val="VerbatimChar"/>
+                <w:lang w:val="es"/>
+              </w:rPr>
+              <w:t xml:space="preserve">seat_map_seat</w:t>
+            </w:r>
+            <w:r>
+              <w:rPr>
+                <w:lang w:val="es"/>
+              </w:rPr>
+              <w:t xml:space="preserve">,</w:t>
+            </w:r>
+            <w:r>
+              <w:rPr>
+                <w:lang w:val="es"/>
+              </w:rPr>
+              <w:t xml:space="preserve"> </w:t>
+            </w:r>
+            <w:r>
+              <w:rPr>
+                <w:rStyle w:val="VerbatimChar"/>
+                <w:lang w:val="es"/>
+              </w:rPr>
+              <w:t xml:space="preserve">aircraft</w:t>
+            </w:r>
+          </w:p>
+        </w:tc>
+      </w:tr>
+      <w:tr>
+        <w:tc>
+          <w:tcPr/>
+          <w:p>
+            <w:pPr>
+              <w:pStyle w:val="Compact"/>
+            </w:pPr>
+            <w:r>
+              <w:rPr>
+                <w:lang w:val="es"/>
+              </w:rPr>
+              <w:t xml:space="preserve">2</w:t>
+            </w:r>
+          </w:p>
+        </w:tc>
+        <w:tc>
+          <w:tcPr/>
+          <w:p>
+            <w:pPr>
+              <w:pStyle w:val="Compact"/>
+            </w:pPr>
+            <w:r>
+              <w:rPr>
+                <w:lang w:val="es"/>
+              </w:rPr>
+              <w:t xml:space="preserve">Programación y operación</w:t>
+            </w:r>
+          </w:p>
+        </w:tc>
+        <w:tc>
+          <w:tcPr/>
+          <w:p>
+            <w:pPr>
+              <w:pStyle w:val="Compact"/>
+            </w:pPr>
+            <w:r>
+              <w:rPr>
+                <w:rStyle w:val="VerbatimChar"/>
+                <w:lang w:val="es"/>
+              </w:rPr>
+              <w:t xml:space="preserve">scheduled_flight</w:t>
+            </w:r>
+            <w:r>
+              <w:rPr>
+                <w:lang w:val="es"/>
+              </w:rPr>
+              <w:t xml:space="preserve">,</w:t>
+            </w:r>
+            <w:r>
+              <w:rPr>
+                <w:lang w:val="es"/>
+              </w:rPr>
+              <w:t xml:space="preserve"> </w:t>
+            </w:r>
+            <w:r>
+              <w:rPr>
+                <w:rStyle w:val="VerbatimChar"/>
+                <w:lang w:val="es"/>
+              </w:rPr>
+              <w:t xml:space="preserve">flight_instance</w:t>
+            </w:r>
+            <w:r>
+              <w:rPr>
+                <w:lang w:val="es"/>
+              </w:rPr>
+              <w:t xml:space="preserve">,</w:t>
+            </w:r>
+            <w:r>
+              <w:rPr>
+                <w:lang w:val="es"/>
+              </w:rPr>
+              <w:t xml:space="preserve"> </w:t>
+            </w:r>
+            <w:r>
+              <w:rPr>
+                <w:rStyle w:val="VerbatimChar"/>
+                <w:lang w:val="es"/>
+              </w:rPr>
+              <w:t xml:space="preserve">flight_inventory</w:t>
+            </w:r>
+          </w:p>
+        </w:tc>
+      </w:tr>
+      <w:tr>
+        <w:tc>
+          <w:tcPr/>
+          <w:p>
+            <w:pPr>
+              <w:pStyle w:val="Compact"/>
+            </w:pPr>
+            <w:r>
+              <w:rPr>
+                <w:lang w:val="es"/>
+              </w:rPr>
+              <w:t xml:space="preserve">3</w:t>
+            </w:r>
+          </w:p>
+        </w:tc>
+        <w:tc>
+          <w:tcPr/>
+          <w:p>
+            <w:pPr>
+              <w:pStyle w:val="Compact"/>
+            </w:pPr>
+            <w:r>
+              <w:rPr>
+                <w:lang w:val="es"/>
+              </w:rPr>
+              <w:t xml:space="preserve">Tarifas</w:t>
+            </w:r>
+          </w:p>
+        </w:tc>
+        <w:tc>
+          <w:tcPr/>
+          <w:p>
+            <w:pPr>
+              <w:pStyle w:val="Compact"/>
+            </w:pPr>
+            <w:r>
+              <w:rPr>
+                <w:rStyle w:val="VerbatimChar"/>
+                <w:lang w:val="es"/>
+              </w:rPr>
+              <w:t xml:space="preserve">fare_rule</w:t>
+            </w:r>
+            <w:r>
+              <w:rPr>
+                <w:lang w:val="es"/>
+              </w:rPr>
+              <w:t xml:space="preserve">,</w:t>
+            </w:r>
+            <w:r>
+              <w:rPr>
+                <w:lang w:val="es"/>
+              </w:rPr>
+              <w:t xml:space="preserve"> </w:t>
+            </w:r>
+            <w:r>
+              <w:rPr>
+                <w:rStyle w:val="VerbatimChar"/>
+                <w:lang w:val="es"/>
+              </w:rPr>
+              <w:t xml:space="preserve">fare_class</w:t>
+            </w:r>
+            <w:r>
+              <w:rPr>
+                <w:lang w:val="es"/>
+              </w:rPr>
+              <w:t xml:space="preserve">,</w:t>
+            </w:r>
+            <w:r>
+              <w:rPr>
+                <w:lang w:val="es"/>
+              </w:rPr>
+              <w:t xml:space="preserve"> </w:t>
+            </w:r>
+            <w:r>
+              <w:rPr>
+                <w:rStyle w:val="VerbatimChar"/>
+                <w:lang w:val="es"/>
+              </w:rPr>
+              <w:t xml:space="preserve">fare</w:t>
+            </w:r>
+          </w:p>
+        </w:tc>
+      </w:tr>
+      <w:tr>
+        <w:tc>
+          <w:tcPr/>
+          <w:p>
+            <w:pPr>
+              <w:pStyle w:val="Compact"/>
+            </w:pPr>
+            <w:r>
+              <w:rPr>
+                <w:lang w:val="es"/>
+              </w:rPr>
+              <w:t xml:space="preserve">4</w:t>
+            </w:r>
+          </w:p>
+        </w:tc>
+        <w:tc>
+          <w:tcPr/>
+          <w:p>
+            <w:pPr>
+              <w:pStyle w:val="Compact"/>
+            </w:pPr>
+            <w:r>
+              <w:rPr>
+                <w:lang w:val="es"/>
+              </w:rPr>
+              <w:t xml:space="preserve">Personas y agencias</w:t>
+            </w:r>
+          </w:p>
+        </w:tc>
+        <w:tc>
+          <w:tcPr/>
+          <w:p>
+            <w:pPr>
+              <w:pStyle w:val="Compact"/>
+            </w:pPr>
+            <w:r>
+              <w:rPr>
+                <w:rStyle w:val="VerbatimChar"/>
+                <w:lang w:val="es"/>
+              </w:rPr>
+              <w:t xml:space="preserve">passenger</w:t>
+            </w:r>
+            <w:r>
+              <w:rPr>
+                <w:lang w:val="es"/>
+              </w:rPr>
+              <w:t xml:space="preserve">,</w:t>
+            </w:r>
+            <w:r>
+              <w:rPr>
+                <w:lang w:val="es"/>
+              </w:rPr>
+              <w:t xml:space="preserve"> </w:t>
+            </w:r>
+            <w:r>
+              <w:rPr>
+                <w:rStyle w:val="VerbatimChar"/>
+                <w:lang w:val="es"/>
+              </w:rPr>
+              <w:t xml:space="preserve">agency</w:t>
+            </w:r>
+          </w:p>
+        </w:tc>
+      </w:tr>
+      <w:tr>
+        <w:tc>
+          <w:tcPr/>
+          <w:p>
+            <w:pPr>
+              <w:pStyle w:val="Compact"/>
+            </w:pPr>
+            <w:r>
+              <w:rPr>
+                <w:lang w:val="es"/>
+              </w:rPr>
+              <w:t xml:space="preserve">5</w:t>
+            </w:r>
+          </w:p>
+        </w:tc>
+        <w:tc>
+          <w:tcPr/>
+          <w:p>
+            <w:pPr>
+              <w:pStyle w:val="Compact"/>
+            </w:pPr>
+            <w:r>
+              <w:rPr>
+                <w:lang w:val="es"/>
+              </w:rPr>
+              <w:t xml:space="preserve">Reserva</w:t>
+            </w:r>
+          </w:p>
+        </w:tc>
+        <w:tc>
+          <w:tcPr/>
+          <w:p>
+            <w:pPr>
+              <w:pStyle w:val="Compact"/>
+            </w:pPr>
+            <w:r>
+              <w:rPr>
+                <w:rStyle w:val="VerbatimChar"/>
+                <w:lang w:val="es"/>
+              </w:rPr>
+              <w:t xml:space="preserve">reservation</w:t>
+            </w:r>
+            <w:r>
+              <w:rPr>
+                <w:lang w:val="es"/>
+              </w:rPr>
+              <w:t xml:space="preserve">,</w:t>
+            </w:r>
+            <w:r>
+              <w:rPr>
+                <w:lang w:val="es"/>
+              </w:rPr>
+              <w:t xml:space="preserve"> </w:t>
+            </w:r>
+            <w:r>
+              <w:rPr>
+                <w:rStyle w:val="VerbatimChar"/>
+                <w:lang w:val="es"/>
+              </w:rPr>
+              <w:t xml:space="preserve">reservation_passenger</w:t>
+            </w:r>
+            <w:r>
+              <w:rPr>
+                <w:lang w:val="es"/>
+              </w:rPr>
+              <w:t xml:space="preserve">,</w:t>
+            </w:r>
+            <w:r>
+              <w:rPr>
+                <w:lang w:val="es"/>
+              </w:rPr>
+              <w:t xml:space="preserve"> </w:t>
+            </w:r>
+            <w:r>
+              <w:rPr>
+                <w:rStyle w:val="VerbatimChar"/>
+                <w:lang w:val="es"/>
+              </w:rPr>
+              <w:t xml:space="preserve">itinerary</w:t>
+            </w:r>
+            <w:r>
+              <w:rPr>
+                <w:lang w:val="es"/>
+              </w:rPr>
+              <w:t xml:space="preserve">,</w:t>
+            </w:r>
+            <w:r>
+              <w:rPr>
+                <w:lang w:val="es"/>
+              </w:rPr>
+              <w:t xml:space="preserve"> </w:t>
+            </w:r>
+            <w:r>
+              <w:rPr>
+                <w:rStyle w:val="VerbatimChar"/>
+                <w:lang w:val="es"/>
+              </w:rPr>
+              <w:t xml:space="preserve">itinerary_segment</w:t>
+            </w:r>
+          </w:p>
+        </w:tc>
+      </w:tr>
+      <w:tr>
+        <w:tc>
+          <w:tcPr/>
+          <w:p>
+            <w:pPr>
+              <w:pStyle w:val="Compact"/>
+            </w:pPr>
+            <w:r>
+              <w:rPr>
+                <w:lang w:val="es"/>
+              </w:rPr>
+              <w:t xml:space="preserve">6</w:t>
+            </w:r>
+          </w:p>
+        </w:tc>
+        <w:tc>
+          <w:tcPr/>
+          <w:p>
+            <w:pPr>
+              <w:pStyle w:val="Compact"/>
+            </w:pPr>
+            <w:r>
+              <w:rPr>
+                <w:lang w:val="es"/>
+              </w:rPr>
+              <w:t xml:space="preserve">Emisión</w:t>
+            </w:r>
+          </w:p>
+        </w:tc>
+        <w:tc>
+          <w:tcPr/>
+          <w:p>
+            <w:pPr>
+              <w:pStyle w:val="Compact"/>
+            </w:pPr>
+            <w:r>
+              <w:rPr>
+                <w:rStyle w:val="VerbatimChar"/>
+                <w:lang w:val="es"/>
+              </w:rPr>
+              <w:t xml:space="preserve">ticket</w:t>
+            </w:r>
+            <w:r>
+              <w:rPr>
+                <w:lang w:val="es"/>
+              </w:rPr>
+              <w:t xml:space="preserve">,</w:t>
+            </w:r>
+            <w:r>
+              <w:rPr>
+                <w:lang w:val="es"/>
+              </w:rPr>
+              <w:t xml:space="preserve"> </w:t>
+            </w:r>
+            <w:r>
+              <w:rPr>
+                <w:rStyle w:val="VerbatimChar"/>
+                <w:lang w:val="es"/>
+              </w:rPr>
+              <w:t xml:space="preserve">seat_assignment</w:t>
+            </w:r>
+            <w:r>
+              <w:rPr>
+                <w:lang w:val="es"/>
+              </w:rPr>
+              <w:t xml:space="preserve">,</w:t>
+            </w:r>
+            <w:r>
+              <w:rPr>
+                <w:lang w:val="es"/>
+              </w:rPr>
+              <w:t xml:space="preserve"> </w:t>
+            </w:r>
+            <w:r>
+              <w:rPr>
+                <w:rStyle w:val="VerbatimChar"/>
+                <w:lang w:val="es"/>
+              </w:rPr>
+              <w:t xml:space="preserve">ancillary</w:t>
+            </w:r>
+          </w:p>
+        </w:tc>
+      </w:tr>
+      <w:tr>
+        <w:tc>
+          <w:tcPr/>
+          <w:p>
+            <w:pPr>
+              <w:pStyle w:val="Compact"/>
+            </w:pPr>
+            <w:r>
+              <w:rPr>
+                <w:lang w:val="es"/>
+              </w:rPr>
+              <w:t xml:space="preserve">7</w:t>
+            </w:r>
+          </w:p>
+        </w:tc>
+        <w:tc>
+          <w:tcPr/>
+          <w:p>
+            <w:pPr>
+              <w:pStyle w:val="Compact"/>
+            </w:pPr>
+            <w:r>
+              <w:rPr>
+                <w:lang w:val="es"/>
+              </w:rPr>
+              <w:t xml:space="preserve">Pagos</w:t>
+            </w:r>
+          </w:p>
+        </w:tc>
+        <w:tc>
+          <w:tcPr/>
+          <w:p>
+            <w:pPr>
+              <w:pStyle w:val="Compact"/>
+            </w:pPr>
+            <w:r>
+              <w:rPr>
+                <w:rStyle w:val="VerbatimChar"/>
+                <w:lang w:val="es"/>
+              </w:rPr>
+              <w:t xml:space="preserve">payment</w:t>
+            </w:r>
+            <w:r>
+              <w:rPr>
+                <w:lang w:val="es"/>
+              </w:rPr>
+              <w:t xml:space="preserve">,</w:t>
+            </w:r>
+            <w:r>
+              <w:rPr>
+                <w:lang w:val="es"/>
+              </w:rPr>
+              <w:t xml:space="preserve"> </w:t>
+            </w:r>
+            <w:r>
+              <w:rPr>
+                <w:rStyle w:val="VerbatimChar"/>
+                <w:lang w:val="es"/>
+              </w:rPr>
+              <w:t xml:space="preserve">payment_event</w:t>
+            </w:r>
+            <w:r>
+              <w:rPr>
+                <w:lang w:val="es"/>
+              </w:rPr>
+              <w:t xml:space="preserve">,</w:t>
+            </w:r>
+            <w:r>
+              <w:rPr>
+                <w:lang w:val="es"/>
+              </w:rPr>
+              <w:t xml:space="preserve"> </w:t>
+            </w:r>
+            <w:r>
+              <w:rPr>
+                <w:rStyle w:val="VerbatimChar"/>
+                <w:lang w:val="es"/>
+              </w:rPr>
+              <w:t xml:space="preserve">refund</w:t>
+            </w:r>
+          </w:p>
+        </w:tc>
+      </w:tr>
+      <w:tr>
+        <w:tc>
+          <w:tcPr/>
+          <w:p>
+            <w:pPr>
+              <w:pStyle w:val="Compact"/>
+            </w:pPr>
+            <w:r>
+              <w:rPr>
+                <w:lang w:val="es"/>
+              </w:rPr>
+              <w:t xml:space="preserve">8</w:t>
+            </w:r>
+          </w:p>
+        </w:tc>
+        <w:tc>
+          <w:tcPr/>
+          <w:p>
+            <w:pPr>
+              <w:pStyle w:val="Compact"/>
+            </w:pPr>
+            <w:r>
+              <w:rPr>
+                <w:lang w:val="es"/>
+              </w:rPr>
+              <w:t xml:space="preserve">Auditoría</w:t>
+            </w:r>
+          </w:p>
+        </w:tc>
+        <w:tc>
+          <w:tcPr/>
+          <w:p>
+            <w:pPr>
+              <w:pStyle w:val="Compact"/>
+            </w:pPr>
+            <w:r>
+              <w:rPr>
+                <w:rStyle w:val="VerbatimChar"/>
+                <w:lang w:val="es"/>
+              </w:rPr>
+              <w:t xml:space="preserve">reservation_event</w:t>
+            </w:r>
+          </w:p>
+        </w:tc>
+      </w:tr>
+      <w:tr>
+        <w:tc>
+          <w:tcPr/>
+          <w:p>
+            <w:pPr>
+              <w:pStyle w:val="Compact"/>
+            </w:pPr>
+            <w:r>
+              <w:rPr>
+                <w:lang w:val="es"/>
+              </w:rPr>
+              <w:t xml:space="preserve">9</w:t>
+            </w:r>
+          </w:p>
+        </w:tc>
+        <w:tc>
+          <w:tcPr/>
+          <w:p>
+            <w:pPr>
+              <w:pStyle w:val="Compact"/>
+            </w:pPr>
+            <w:r>
+              <w:rPr>
+                <w:lang w:val="es"/>
+              </w:rPr>
+              <w:t xml:space="preserve">Vistas de apoyo</w:t>
+            </w:r>
+          </w:p>
+        </w:tc>
+        <w:tc>
+          <w:tcPr/>
+          <w:p>
+            <w:pPr>
+              <w:pStyle w:val="Compact"/>
+            </w:pPr>
+            <w:r>
+              <w:rPr>
+                <w:rStyle w:val="VerbatimChar"/>
+                <w:lang w:val="es"/>
+              </w:rPr>
+              <w:t xml:space="preserve">v_flight_availability</w:t>
+            </w:r>
+            <w:r>
+              <w:rPr>
+                <w:lang w:val="es"/>
+              </w:rPr>
+              <w:t xml:space="preserve">,</w:t>
+            </w:r>
+            <w:r>
+              <w:rPr>
+                <w:lang w:val="es"/>
+              </w:rPr>
+              <w:t xml:space="preserve"> </w:t>
+            </w:r>
+            <w:r>
+              <w:rPr>
+                <w:rStyle w:val="VerbatimChar"/>
+                <w:lang w:val="es"/>
+              </w:rPr>
+              <w:t xml:space="preserve">v_seat_map_capacity</w:t>
+            </w:r>
+            <w:r>
+              <w:rPr>
+                <w:lang w:val="es"/>
+              </w:rPr>
+              <w:t xml:space="preserve">,</w:t>
+            </w:r>
+            <w:r>
+              <w:rPr>
+                <w:lang w:val="es"/>
+              </w:rPr>
+              <w:t xml:space="preserve"> </w:t>
+            </w:r>
+            <w:r>
+              <w:rPr>
+                <w:rStyle w:val="VerbatimChar"/>
+                <w:lang w:val="es"/>
+              </w:rPr>
+              <w:t xml:space="preserve">v_oversell_check</w:t>
+            </w:r>
+            <w:r>
+              <w:rPr>
+                <w:lang w:val="es"/>
+              </w:rPr>
+              <w:t xml:space="preserve">,</w:t>
+            </w:r>
+            <w:r>
+              <w:rPr>
+                <w:lang w:val="es"/>
+              </w:rPr>
+              <w:t xml:space="preserve"> </w:t>
+            </w:r>
+            <w:r>
+              <w:rPr>
+                <w:rStyle w:val="VerbatimChar"/>
+                <w:lang w:val="es"/>
+              </w:rPr>
+              <w:t xml:space="preserve">v_inventory_reconciliation</w:t>
+            </w:r>
+          </w:p>
+        </w:tc>
+      </w:tr>
+    </w:tbl>
+    <w:p>
+      <w:pPr>
+        <w:pStyle w:val="BodyText"/>
+      </w:pPr>
+      <w:r>
+        <w:rPr>
+          <w:b/>
+          <w:bCs/>
+          <w:lang w:val="es"/>
+        </w:rPr>
+        <w:t xml:space="preserve">Razón obligatoria — las claves foráneas.</w:t>
+      </w:r>
+      <w:r>
+        <w:rPr>
+          <w:lang w:val="es"/>
+        </w:rPr>
+        <w:t xml:space="preserve"> </w:t>
+      </w:r>
+      <w:r>
+        <w:rPr>
+          <w:lang w:val="es"/>
+        </w:rPr>
+        <w:t xml:space="preserve">PostgreSQL rechaza una referencia a una tabla que todavía no existe. Como</w:t>
+      </w:r>
+      <w:r>
+        <w:rPr>
+          <w:lang w:val="es"/>
+        </w:rPr>
+        <w:t xml:space="preserve"> </w:t>
+      </w:r>
+      <w:r>
+        <w:rPr>
+          <w:rStyle w:val="VerbatimChar"/>
+          <w:lang w:val="es"/>
+        </w:rPr>
+        <w:t xml:space="preserve">route</w:t>
+      </w:r>
+      <w:r>
+        <w:rPr>
+          <w:lang w:val="es"/>
+        </w:rPr>
+        <w:t xml:space="preserve"> </w:t>
+      </w:r>
+      <w:r>
+        <w:rPr>
+          <w:lang w:val="es"/>
+        </w:rPr>
+        <w:t xml:space="preserve">apunta a</w:t>
+      </w:r>
+      <w:r>
+        <w:rPr>
+          <w:lang w:val="es"/>
+        </w:rPr>
+        <w:t xml:space="preserve"> </w:t>
+      </w:r>
+      <w:r>
+        <w:rPr>
+          <w:rStyle w:val="VerbatimChar"/>
+          <w:lang w:val="es"/>
+        </w:rPr>
+        <w:t xml:space="preserve">airport</w:t>
+      </w:r>
+      <w:r>
+        <w:rPr>
+          <w:lang w:val="es"/>
+        </w:rPr>
+        <w:t xml:space="preserve">,</w:t>
+      </w:r>
+      <w:r>
+        <w:rPr>
+          <w:lang w:val="es"/>
+        </w:rPr>
+        <w:t xml:space="preserve"> </w:t>
+      </w:r>
+      <w:r>
+        <w:rPr>
+          <w:rStyle w:val="VerbatimChar"/>
+          <w:lang w:val="es"/>
+        </w:rPr>
+        <w:t xml:space="preserve">airport</w:t>
+      </w:r>
+      <w:r>
+        <w:rPr>
+          <w:lang w:val="es"/>
+        </w:rPr>
+        <w:t xml:space="preserve"> </w:t>
+      </w:r>
+      <w:r>
+        <w:rPr>
+          <w:lang w:val="es"/>
+        </w:rPr>
+        <w:t xml:space="preserve">tiene que crearse antes. Como</w:t>
+      </w:r>
+      <w:r>
+        <w:rPr>
+          <w:lang w:val="es"/>
+        </w:rPr>
+        <w:t xml:space="preserve"> </w:t>
+      </w:r>
+      <w:r>
+        <w:rPr>
+          <w:rStyle w:val="VerbatimChar"/>
+          <w:lang w:val="es"/>
+        </w:rPr>
+        <w:t xml:space="preserve">flight_instance</w:t>
+      </w:r>
+      <w:r>
+        <w:rPr>
+          <w:lang w:val="es"/>
+        </w:rPr>
+        <w:t xml:space="preserve"> </w:t>
+      </w:r>
+      <w:r>
+        <w:rPr>
+          <w:lang w:val="es"/>
+        </w:rPr>
+        <w:t xml:space="preserve">apunta a</w:t>
+      </w:r>
+      <w:r>
+        <w:rPr>
+          <w:lang w:val="es"/>
+        </w:rPr>
+        <w:t xml:space="preserve"> </w:t>
+      </w:r>
+      <w:r>
+        <w:rPr>
+          <w:rStyle w:val="VerbatimChar"/>
+          <w:lang w:val="es"/>
+        </w:rPr>
+        <w:t xml:space="preserve">scheduled_flight</w:t>
+      </w:r>
+      <w:r>
+        <w:rPr>
+          <w:lang w:val="es"/>
+        </w:rPr>
+        <w:t xml:space="preserve"> </w:t>
+      </w:r>
+      <w:r>
+        <w:rPr>
+          <w:lang w:val="es"/>
+        </w:rPr>
+        <w:t xml:space="preserve">y a</w:t>
+      </w:r>
+      <w:r>
+        <w:rPr>
+          <w:lang w:val="es"/>
+        </w:rPr>
+        <w:t xml:space="preserve"> </w:t>
+      </w:r>
+      <w:r>
+        <w:rPr>
+          <w:rStyle w:val="VerbatimChar"/>
+          <w:lang w:val="es"/>
+        </w:rPr>
+        <w:t xml:space="preserve">aircraft</w:t>
+      </w:r>
+      <w:r>
+        <w:rPr>
+          <w:lang w:val="es"/>
+        </w:rPr>
+        <w:t xml:space="preserve">, ambas deben existir primero. El orden es, literalmente, un</w:t>
+      </w:r>
+      <w:r>
+        <w:rPr>
+          <w:lang w:val="es"/>
+        </w:rPr>
+        <w:t xml:space="preserve"> </w:t>
+      </w:r>
+      <w:r>
+        <w:rPr>
+          <w:b/>
+          <w:bCs/>
+          <w:lang w:val="es"/>
+        </w:rPr>
+        <w:t xml:space="preserve">ordenamiento topológico del grafo de dependencias</w:t>
+      </w:r>
+      <w:r>
+        <w:rPr>
+          <w:lang w:val="es"/>
+        </w:rPr>
+        <w:t xml:space="preserve">: no hay libertad para reordenarlo sin romper la creación del esquema.</w:t>
+      </w:r>
+    </w:p>
+    <w:p>
+      <w:pPr>
+        <w:pStyle w:val="BodyText"/>
+      </w:pPr>
+      <w:r>
+        <w:rPr>
+          <w:b/>
+          <w:bCs/>
+          <w:lang w:val="es"/>
+        </w:rPr>
+        <w:t xml:space="preserve">Razón significativa — y esto es lo interesante:</w:t>
+      </w:r>
+      <w:r>
+        <w:rPr>
+          <w:lang w:val="es"/>
+        </w:rPr>
+        <w:t xml:space="preserve"> </w:t>
+      </w:r>
+      <w:r>
+        <w:rPr>
+          <w:lang w:val="es"/>
+        </w:rPr>
+        <w:t xml:space="preserve">ese mismo orden coincide con</w:t>
+      </w:r>
+      <w:r>
+        <w:rPr>
+          <w:lang w:val="es"/>
+        </w:rPr>
+        <w:t xml:space="preserve"> </w:t>
+      </w:r>
+      <w:r>
+        <w:rPr>
+          <w:b/>
+          <w:bCs/>
+          <w:lang w:val="es"/>
+        </w:rPr>
+        <w:t xml:space="preserve">dos cosas más</w:t>
+      </w:r>
+      <w:r>
+        <w:rPr>
+          <w:lang w:val="es"/>
+        </w:rPr>
+        <w:t xml:space="preserve">, y no por casualidad.</w:t>
+      </w:r>
+    </w:p>
+    <w:p>
+      <w:pPr>
+        <w:numPr>
+          <w:ilvl w:val="0"/>
+          <w:numId w:val="1012"/>
+        </w:numPr>
+      </w:pPr>
+      <w:r>
+        <w:rPr>
+          <w:b/>
+          <w:bCs/>
+          <w:lang w:val="es"/>
+        </w:rPr>
+        <w:t xml:space="preserve">Va de lo más estable a lo más volátil.</w:t>
+      </w:r>
+      <w:r>
+        <w:rPr>
+          <w:lang w:val="es"/>
+        </w:rPr>
+        <w:t xml:space="preserve"> </w:t>
+      </w:r>
+      <w:r>
+        <w:rPr>
+          <w:lang w:val="es"/>
+        </w:rPr>
+        <w:t xml:space="preserve">Los aeropuertos y las rutas cambian un par de veces al año; los vuelos programados, cada temporada; las instancias de vuelo, a diario; las reservas y los eventos de auditoría, miles de veces al día.</w:t>
+      </w:r>
+      <w:r>
+        <w:rPr>
+          <w:lang w:val="es"/>
+        </w:rPr>
+        <w:t xml:space="preserve"> </w:t>
+      </w:r>
+      <w:r>
+        <w:rPr>
+          <w:b/>
+          <w:bCs/>
+          <w:lang w:val="es"/>
+        </w:rPr>
+        <w:t xml:space="preserve">Lo que depende de algo cambia más rápido que aquello de lo que depende</w:t>
+      </w:r>
+      <w:r>
+        <w:rPr>
+          <w:lang w:val="es"/>
+        </w:rPr>
+        <w:t xml:space="preserve"> </w:t>
+      </w:r>
+      <w:r>
+        <w:rPr>
+          <w:lang w:val="es"/>
+        </w:rPr>
+        <w:t xml:space="preserve">— una entidad estable puede sostener a muchas volátiles, pero no al revés. Si el catálogo de aeropuertos cambiara con la misma frecuencia que las reservas, el modelo entero sería insostenible.</w:t>
+      </w:r>
+    </w:p>
+    <w:p>
+      <w:pPr>
+        <w:numPr>
+          <w:ilvl w:val="0"/>
+          <w:numId w:val="1012"/>
+        </w:numPr>
+      </w:pPr>
+      <w:r>
+        <w:rPr>
+          <w:b/>
+          <w:bCs/>
+          <w:lang w:val="es"/>
+        </w:rPr>
+        <w:t xml:space="preserve">Se lee como el flujo del negocio.</w:t>
+      </w:r>
+      <w:r>
+        <w:rPr>
+          <w:lang w:val="es"/>
+        </w:rPr>
+        <w:t xml:space="preserve"> </w:t>
+      </w:r>
+      <w:r>
+        <w:rPr>
+          <w:lang w:val="es"/>
+        </w:rPr>
+        <w:t xml:space="preserve">Primero existe una red de aeropuertos y una flota; sobre eso se programan vuelos; a esos vuelos se les pone precio; entonces aparecen las personas; las personas reservan; la reserva emite tiquetes; los tiquetes se pagan; y todo lo anterior queda auditado.</w:t>
+      </w:r>
+      <w:r>
+        <w:rPr>
+          <w:lang w:val="es"/>
+        </w:rPr>
+        <w:t xml:space="preserve"> </w:t>
+      </w:r>
+      <w:r>
+        <w:rPr>
+          <w:b/>
+          <w:bCs/>
+          <w:lang w:val="es"/>
+        </w:rPr>
+        <w:t xml:space="preserve">El esquema se puede leer de arriba abajo como la historia de cómo opera una aerolínea</w:t>
+      </w:r>
+      <w:r>
+        <w:rPr>
+          <w:lang w:val="es"/>
+        </w:rPr>
+        <w:t xml:space="preserve">, y esa es la mejor forma de presentarlo en la sustentación: no como una lista de 26 tablas, sino como seis capas que se apoyan una sobre otra.</w:t>
+      </w:r>
+    </w:p>
+    <w:p>
+      <w:pPr>
+        <w:pStyle w:val="FirstParagraph"/>
+      </w:pPr>
+      <w:r>
+        <w:rPr>
+          <w:lang w:val="es"/>
+        </w:rPr>
+        <w:t xml:space="preserve">Las</w:t>
+      </w:r>
+      <w:r>
+        <w:rPr>
+          <w:lang w:val="es"/>
+        </w:rPr>
+        <w:t xml:space="preserve"> </w:t>
+      </w:r>
+      <w:r>
+        <w:rPr>
+          <w:b/>
+          <w:bCs/>
+          <w:lang w:val="es"/>
+        </w:rPr>
+        <w:t xml:space="preserve">vistas van al final</w:t>
+      </w:r>
+      <w:r>
+        <w:rPr>
+          <w:lang w:val="es"/>
+        </w:rPr>
+        <w:t xml:space="preserve"> </w:t>
+      </w:r>
+      <w:r>
+        <w:rPr>
+          <w:lang w:val="es"/>
+        </w:rPr>
+        <w:t xml:space="preserve">por la misma razón que las tablas van en ese orden: una vista solo puede consultar objetos que ya existen. Y son cuatro con propósitos distintos:</w:t>
+      </w:r>
+      <w:r>
+        <w:rPr>
+          <w:lang w:val="es"/>
+        </w:rPr>
+        <w:t xml:space="preserve"> </w:t>
+      </w:r>
+      <w:r>
+        <w:rPr>
+          <w:rStyle w:val="VerbatimChar"/>
+          <w:lang w:val="es"/>
+        </w:rPr>
+        <w:t xml:space="preserve">v_flight_availability</w:t>
+      </w:r>
+      <w:r>
+        <w:rPr>
+          <w:lang w:val="es"/>
+        </w:rPr>
+        <w:t xml:space="preserve"> </w:t>
+      </w:r>
+      <w:r>
+        <w:rPr>
+          <w:lang w:val="es"/>
+        </w:rPr>
+        <w:t xml:space="preserve">sostiene la búsqueda (RNF-P1),</w:t>
+      </w:r>
+      <w:r>
+        <w:rPr>
+          <w:lang w:val="es"/>
+        </w:rPr>
+        <w:t xml:space="preserve"> </w:t>
+      </w:r>
+      <w:r>
+        <w:rPr>
+          <w:rStyle w:val="VerbatimChar"/>
+          <w:lang w:val="es"/>
+        </w:rPr>
+        <w:t xml:space="preserve">v_seat_map_capacity</w:t>
+      </w:r>
+      <w:r>
+        <w:rPr>
+          <w:lang w:val="es"/>
+        </w:rPr>
+        <w:t xml:space="preserve"> </w:t>
+      </w:r>
+      <w:r>
+        <w:rPr>
+          <w:lang w:val="es"/>
+        </w:rPr>
+        <w:t xml:space="preserve">deriva la capacidad por cabina desde el mapa de sillas,</w:t>
+      </w:r>
+      <w:r>
+        <w:rPr>
+          <w:lang w:val="es"/>
+        </w:rPr>
+        <w:t xml:space="preserve"> </w:t>
+      </w:r>
+      <w:r>
+        <w:rPr>
+          <w:rStyle w:val="VerbatimChar"/>
+          <w:lang w:val="es"/>
+        </w:rPr>
+        <w:t xml:space="preserve">v_oversell_check</w:t>
+      </w:r>
+      <w:r>
+        <w:rPr>
+          <w:lang w:val="es"/>
+        </w:rPr>
+        <w:t xml:space="preserve"> </w:t>
+      </w:r>
+      <w:r>
+        <w:rPr>
+          <w:lang w:val="es"/>
+        </w:rPr>
+        <w:t xml:space="preserve">es la</w:t>
+      </w:r>
+      <w:r>
+        <w:rPr>
+          <w:lang w:val="es"/>
+        </w:rPr>
+        <w:t xml:space="preserve"> </w:t>
+      </w:r>
+      <w:r>
+        <w:rPr>
+          <w:b/>
+          <w:bCs/>
+          <w:lang w:val="es"/>
+        </w:rPr>
+        <w:t xml:space="preserve">aserción del invariante</w:t>
+      </w:r>
+      <w:r>
+        <w:rPr>
+          <w:lang w:val="es"/>
+        </w:rPr>
+        <w:t xml:space="preserve"> </w:t>
+      </w:r>
+      <w:r>
+        <w:rPr>
+          <w:lang w:val="es"/>
+        </w:rPr>
+        <w:t xml:space="preserve">de no-sobreventa (debe devolver siempre cero filas) y</w:t>
+      </w:r>
+      <w:r>
+        <w:rPr>
+          <w:lang w:val="es"/>
+        </w:rPr>
+        <w:t xml:space="preserve"> </w:t>
+      </w:r>
+      <w:r>
+        <w:rPr>
+          <w:rStyle w:val="VerbatimChar"/>
+          <w:lang w:val="es"/>
+        </w:rPr>
+        <w:t xml:space="preserve">v_inventory_reconciliation</w:t>
+      </w:r>
+      <w:r>
+        <w:rPr>
+          <w:lang w:val="es"/>
+        </w:rPr>
+        <w:t xml:space="preserve"> </w:t>
+      </w:r>
+      <w:r>
+        <w:rPr>
+          <w:lang w:val="es"/>
+        </w:rPr>
+        <w:t xml:space="preserve">comprueba que el contador materializado coincide con los tramos realmente vendidos — es decir, vigila la denormalización declarada en §5.5.</w:t>
+      </w:r>
+    </w:p>
+    <w:p>
+      <w:r>
+        <w:pict>
+          <v:rect style="width:0;height:1.5pt" o:hralign="center" o:hrstd="t" o:hr="t"/>
+        </w:pict>
+      </w:r>
+    </w:p>
+    <w:bookmarkEnd w:id="35"/>
+    <w:bookmarkEnd w:id="36"/>
+    <w:bookmarkStart w:id="37" w:name="X909b3bd04e22ae572ac1b194adfed880dcaee6d"/>
+    <w:p>
+      <w:pPr>
+        <w:pStyle w:val="Heading2"/>
+      </w:pPr>
+      <w:r>
+        <w:rPr>
+          <w:lang w:val="es"/>
+        </w:rPr>
+        <w:t xml:space="preserve">6. Resumen: qué se priorizó sobre qué</w:t>
+      </w:r>
+    </w:p>
+    <w:p>
+      <w:pPr>
+        <w:pStyle w:val="FirstParagraph"/>
+      </w:pPr>
+      <w:r>
+        <w:rPr>
+          <w:lang w:val="es"/>
+        </w:rPr>
+        <w:t xml:space="preserve">Toda arquitectura es un conjunto de renuncias. Estas son las que se tomaron, declaradas:</w:t>
+      </w:r>
+    </w:p>
+    <w:tbl>
+      <w:tblPr>
+        <w:tblStyle w:val="Table"/>
+        <w:tblW w:type="auto" w:w="0"/>
+        <w:tblLook w:firstRow="1" w:lastRow="0" w:firstColumn="0" w:lastColumn="0" w:noHBand="0" w:noVBand="0" w:val="0020"/>
+      </w:tblPr>
+      <w:tblGrid>
+        <w:gridCol w:w="1980"/>
+        <w:gridCol w:w="1980"/>
+        <w:gridCol w:w="1980"/>
+        <w:gridCol w:w="1980"/>
+      </w:tblGrid>
+      <w:tr>
+        <w:trPr>
+          <w:tblHeader w:val="on"/>
+        </w:trPr>
+        <w:tc>
+          <w:tcPr/>
+          <w:p>
+            <w:pPr>
+              <w:pStyle w:val="Compact"/>
+            </w:pPr>
+            <w:r>
+              <w:rPr>
+                <w:lang w:val="es"/>
+              </w:rPr>
+              <w:t xml:space="preserve">Se priorizó</w:t>
+            </w:r>
+          </w:p>
+        </w:tc>
+        <w:tc>
+          <w:tcPr/>
+          <w:p>
+            <w:pPr>
+              <w:pStyle w:val="Compact"/>
+            </w:pPr>
+            <w:r>
+              <w:rPr>
+                <w:lang w:val="es"/>
+              </w:rPr>
+              <w:t xml:space="preserve">Sobre</w:t>
+            </w:r>
+          </w:p>
+        </w:tc>
+        <w:tc>
+          <w:tcPr/>
+          <w:p>
+            <w:pPr>
+              <w:pStyle w:val="Compact"/>
+            </w:pPr>
+            <w:r>
+              <w:rPr>
+                <w:lang w:val="es"/>
+              </w:rPr>
+              <w:t xml:space="preserve">Por qué</w:t>
+            </w:r>
+          </w:p>
+        </w:tc>
+        <w:tc>
+          <w:tcPr/>
+          <w:p>
+            <w:pPr>
+              <w:pStyle w:val="Compact"/>
+            </w:pPr>
+            <w:r>
+              <w:rPr>
+                <w:lang w:val="es"/>
+              </w:rPr>
+              <w:t xml:space="preserve">Dónde se paga</w:t>
+            </w:r>
+          </w:p>
+        </w:tc>
+      </w:tr>
+      <w:tr>
+        <w:tc>
+          <w:tcPr/>
+          <w:p>
+            <w:pPr>
+              <w:pStyle w:val="Compact"/>
+            </w:pPr>
+            <w:r>
+              <w:rPr>
+                <w:lang w:val="es"/>
+              </w:rPr>
+              <w:t xml:space="preserve">Corrección del inventario</w:t>
+            </w:r>
+          </w:p>
+        </w:tc>
+        <w:tc>
+          <w:tcPr/>
+          <w:p>
+            <w:pPr>
+              <w:pStyle w:val="Compact"/>
+            </w:pPr>
+            <w:r>
+              <w:rPr>
+                <w:lang w:val="es"/>
+              </w:rPr>
+              <w:t xml:space="preserve">Disponibilidad de 99,99%</w:t>
+            </w:r>
+          </w:p>
+        </w:tc>
+        <w:tc>
+          <w:tcPr/>
+          <w:p>
+            <w:pPr>
+              <w:pStyle w:val="Compact"/>
+            </w:pPr>
+            <w:r>
+              <w:rPr>
+                <w:lang w:val="es"/>
+              </w:rPr>
+              <w:t xml:space="preserve">La sobreventa tiene costo regulatorio; 39 minutos extra de caída al mes, no</w:t>
+            </w:r>
+          </w:p>
+        </w:tc>
+        <w:tc>
+          <w:tcPr/>
+          <w:p>
+            <w:pPr>
+              <w:pStyle w:val="Compact"/>
+            </w:pPr>
+            <w:r>
+              <w:rPr>
+                <w:lang w:val="es"/>
+              </w:rPr>
+              <w:t xml:space="preserve">La disponibilidad se queda en 99,9%</w:t>
+            </w:r>
+          </w:p>
+        </w:tc>
+      </w:tr>
+      <w:tr>
+        <w:tc>
+          <w:tcPr/>
+          <w:p>
+            <w:pPr>
+              <w:pStyle w:val="Compact"/>
+            </w:pPr>
+            <w:r>
+              <w:rPr>
+                <w:lang w:val="es"/>
+              </w:rPr>
+              <w:t xml:space="preserve">Rechazar rápido</w:t>
+            </w:r>
+          </w:p>
+        </w:tc>
+        <w:tc>
+          <w:tcPr/>
+          <w:p>
+            <w:pPr>
+              <w:pStyle w:val="Compact"/>
+            </w:pPr>
+            <w:r>
+              <w:rPr>
+                <w:lang w:val="es"/>
+              </w:rPr>
+              <w:t xml:space="preserve">Confirmar y luego revertir</w:t>
+            </w:r>
+          </w:p>
+        </w:tc>
+        <w:tc>
+          <w:tcPr/>
+          <w:p>
+            <w:pPr>
+              <w:pStyle w:val="Compact"/>
+            </w:pPr>
+            <w:r>
+              <w:rPr>
+                <w:lang w:val="es"/>
+              </w:rPr>
+              <w:t xml:space="preserve">Revertir una venta confirmada es peor que negarla</w:t>
+            </w:r>
+          </w:p>
+        </w:tc>
+        <w:tc>
+          <w:tcPr/>
+          <w:p>
+            <w:pPr>
+              <w:pStyle w:val="Compact"/>
+            </w:pPr>
+            <w:r>
+              <w:rPr>
+                <w:lang w:val="es"/>
+              </w:rPr>
+              <w:t xml:space="preserve">Bloqueo pesimista: menor rendimiento en el punto de contención</w:t>
+            </w:r>
+          </w:p>
+        </w:tc>
+      </w:tr>
+      <w:tr>
+        <w:tc>
+          <w:tcPr/>
+          <w:p>
+            <w:pPr>
+              <w:pStyle w:val="Compact"/>
+            </w:pPr>
+            <w:r>
+              <w:rPr>
+                <w:lang w:val="es"/>
+              </w:rPr>
+              <w:t xml:space="preserve">Delegar el pago</w:t>
+            </w:r>
+          </w:p>
+        </w:tc>
+        <w:tc>
+          <w:tcPr/>
+          <w:p>
+            <w:pPr>
+              <w:pStyle w:val="Compact"/>
+            </w:pPr>
+            <w:r>
+              <w:rPr>
+                <w:lang w:val="es"/>
+              </w:rPr>
+              <w:t xml:space="preserve">Controlar el flujo de pago</w:t>
+            </w:r>
+          </w:p>
+        </w:tc>
+        <w:tc>
+          <w:tcPr/>
+          <w:p>
+            <w:pPr>
+              <w:pStyle w:val="Compact"/>
+            </w:pPr>
+            <w:r>
+              <w:rPr>
+                <w:lang w:val="es"/>
+              </w:rPr>
+              <w:t xml:space="preserve">Reduce el alcance PCI a SAQ-A</w:t>
+            </w:r>
+          </w:p>
+        </w:tc>
+        <w:tc>
+          <w:tcPr/>
+          <w:p>
+            <w:pPr>
+              <w:pStyle w:val="Compact"/>
+            </w:pPr>
+            <w:r>
+              <w:rPr>
+                <w:lang w:val="es"/>
+              </w:rPr>
+              <w:t xml:space="preserve">Dependencia de un tercero, mitigada con conciliación</w:t>
+            </w:r>
+          </w:p>
+        </w:tc>
+      </w:tr>
+      <w:tr>
+        <w:tc>
+          <w:tcPr/>
+          <w:p>
+            <w:pPr>
+              <w:pStyle w:val="Compact"/>
+            </w:pPr>
+            <w:r>
+              <w:rPr>
+                <w:lang w:val="es"/>
+              </w:rPr>
+              <w:t xml:space="preserve">Un PNR por viaje</w:t>
+            </w:r>
+          </w:p>
+        </w:tc>
+        <w:tc>
+          <w:tcPr/>
+          <w:p>
+            <w:pPr>
+              <w:pStyle w:val="Compact"/>
+            </w:pPr>
+            <w:r>
+              <w:rPr>
+                <w:lang w:val="es"/>
+              </w:rPr>
+              <w:t xml:space="preserve">Simplicidad del modelo</w:t>
+            </w:r>
+          </w:p>
+        </w:tc>
+        <w:tc>
+          <w:tcPr/>
+          <w:p>
+            <w:pPr>
+              <w:pStyle w:val="Compact"/>
+            </w:pPr>
+            <w:r>
+              <w:rPr>
+                <w:lang w:val="es"/>
+              </w:rPr>
+              <w:t xml:space="preserve">El pasajero compra un viaje, no tramos sueltos</w:t>
+            </w:r>
+          </w:p>
+        </w:tc>
+        <w:tc>
+          <w:tcPr/>
+          <w:p>
+            <w:pPr>
+              <w:pStyle w:val="Compact"/>
+            </w:pPr>
+            <w:r>
+              <w:rPr>
+                <w:lang w:val="es"/>
+              </w:rPr>
+              <w:t xml:space="preserve">Una entidad adicional y transacciones más largas</w:t>
+            </w:r>
+          </w:p>
+        </w:tc>
+      </w:tr>
+      <w:tr>
+        <w:tc>
+          <w:tcPr/>
+          <w:p>
+            <w:pPr>
+              <w:pStyle w:val="Compact"/>
+            </w:pPr>
+            <w:r>
+              <w:rPr>
+                <w:lang w:val="es"/>
+              </w:rPr>
+              <w:t xml:space="preserve">Monolito modular</w:t>
+            </w:r>
+          </w:p>
+        </w:tc>
+        <w:tc>
+          <w:tcPr/>
+          <w:p>
+            <w:pPr>
+              <w:pStyle w:val="Compact"/>
+            </w:pPr>
+            <w:r>
+              <w:rPr>
+                <w:lang w:val="es"/>
+              </w:rPr>
+              <w:t xml:space="preserve">Microservicios</w:t>
+            </w:r>
+          </w:p>
+        </w:tc>
+        <w:tc>
+          <w:tcPr/>
+          <w:p>
+            <w:pPr>
+              <w:pStyle w:val="Compact"/>
+            </w:pPr>
+            <w:r>
+              <w:rPr>
+                <w:lang w:val="es"/>
+              </w:rPr>
+              <w:t xml:space="preserve">La garantía de inventario</w:t>
+            </w:r>
+            <w:r>
+              <w:rPr>
+                <w:lang w:val="es"/>
+              </w:rPr>
+              <w:t xml:space="preserve"> </w:t>
+            </w:r>
+            <w:r>
+              <w:rPr>
+                <w:b/>
+                <w:bCs/>
+                <w:lang w:val="es"/>
+              </w:rPr>
+              <w:t xml:space="preserve">cabe en una transacción de base de datos</w:t>
+            </w:r>
+          </w:p>
+        </w:tc>
+        <w:tc>
+          <w:tcPr/>
+          <w:p>
+            <w:pPr>
+              <w:pStyle w:val="Compact"/>
+            </w:pPr>
+            <w:r>
+              <w:rPr>
+                <w:lang w:val="es"/>
+              </w:rPr>
+              <w:t xml:space="preserve">Escalado menos granular, aceptable a esta escala</w:t>
+            </w:r>
+          </w:p>
+        </w:tc>
+      </w:tr>
+      <w:tr>
+        <w:tc>
+          <w:tcPr/>
+          <w:p>
+            <w:pPr>
+              <w:pStyle w:val="Compact"/>
+            </w:pPr>
+            <w:r>
+              <w:rPr>
+                <w:lang w:val="es"/>
+              </w:rPr>
+              <w:t xml:space="preserve">Frescura diaria del ETL</w:t>
+            </w:r>
+          </w:p>
+        </w:tc>
+        <w:tc>
+          <w:tcPr/>
+          <w:p>
+            <w:pPr>
+              <w:pStyle w:val="Compact"/>
+            </w:pPr>
+            <w:r>
+              <w:rPr>
+                <w:lang w:val="es"/>
+              </w:rPr>
+              <w:t xml:space="preserve">Datos en tiempo real</w:t>
+            </w:r>
+          </w:p>
+        </w:tc>
+        <w:tc>
+          <w:tcPr/>
+          <w:p>
+            <w:pPr>
+              <w:pStyle w:val="Compact"/>
+            </w:pPr>
+            <w:r>
+              <w:rPr>
+                <w:lang w:val="es"/>
+              </w:rPr>
+              <w:t xml:space="preserve">Las preguntas de gerencia son tácticas, no operativas</w:t>
+            </w:r>
+          </w:p>
+        </w:tc>
+        <w:tc>
+          <w:tcPr/>
+          <w:p>
+            <w:pPr>
+              <w:pStyle w:val="Compact"/>
+            </w:pPr>
+            <w:r>
+              <w:rPr>
+                <w:lang w:val="es"/>
+              </w:rPr>
+              <w:t xml:space="preserve">Ninguno relevante: mejorar la frescura cuesta menos de 1 USD/mes</w:t>
+            </w:r>
+          </w:p>
+        </w:tc>
+      </w:tr>
+    </w:tbl>
+    <w:p>
+      <w:pPr>
+        <w:pStyle w:val="BodyText"/>
+      </w:pPr>
+      <w:r>
+        <w:rPr>
+          <w:lang w:val="es"/>
+        </w:rPr>
+        <w:t xml:space="preserve">La última fila merece una nota, porque es contraintuitiva y es de las más defendibles:</w:t>
+      </w:r>
+      <w:r>
+        <w:rPr>
+          <w:lang w:val="es"/>
+        </w:rPr>
+        <w:t xml:space="preserve"> </w:t>
+      </w:r>
+      <w:r>
+        <w:rPr>
+          <w:b/>
+          <w:bCs/>
+          <w:lang w:val="es"/>
+        </w:rPr>
+        <w:t xml:space="preserve">la decisión de correr el ETL una vez al día no es económica.</w:t>
+      </w:r>
+      <w:r>
+        <w:rPr>
+          <w:lang w:val="es"/>
+        </w:rPr>
+        <w:t xml:space="preserve"> </w:t>
+      </w:r>
+      <w:r>
+        <w:rPr>
+          <w:lang w:val="es"/>
+        </w:rPr>
+        <w:t xml:space="preserve">Multiplicar la frecuencia por 10 sube la factura apenas un 2%, porque el costo está dominado por las bases encendidas, no por el cómputo del ETL. La restricción a diario es de</w:t>
+      </w:r>
+      <w:r>
+        <w:rPr>
+          <w:lang w:val="es"/>
+        </w:rPr>
+        <w:t xml:space="preserve"> </w:t>
+      </w:r>
+      <w:r>
+        <w:rPr>
+          <w:b/>
+          <w:bCs/>
+          <w:lang w:val="es"/>
+        </w:rPr>
+        <w:t xml:space="preserve">valor de negocio</w:t>
+      </w:r>
+      <w:r>
+        <w:rPr>
+          <w:lang w:val="es"/>
+        </w:rPr>
+        <w:t xml:space="preserve"> </w:t>
+      </w:r>
+      <w:r>
+        <w:rPr>
+          <w:lang w:val="es"/>
+        </w:rPr>
+        <w:t xml:space="preserve">— nadie cambia una ruta por lo que pasó hace diez minutos. Confundir ambas cosas llevaría a negar una mejora que es prácticamente gratis.</w:t>
+      </w:r>
+    </w:p>
+    <w:bookmarkEnd w:id="37"/>
+    <w:bookmarkEnd w:id="38"/>
     <w:sectPr>
       <w:footnotePr>
         <w:numRestart w:val="eachSect"/>
@@ -9301,6 +13178,36 @@
     <w:abstractNumId w:val="991"/>
   </w:num>
   <w:num w:numId="1011">
+    <w:abstractNumId w:val="99411"/>
+    <w:lvlOverride w:ilvl="0">
+      <w:startOverride w:val="1"/>
+    </w:lvlOverride>
+    <w:lvlOverride w:ilvl="1">
+      <w:startOverride w:val="1"/>
+    </w:lvlOverride>
+    <w:lvlOverride w:ilvl="2">
+      <w:startOverride w:val="1"/>
+    </w:lvlOverride>
+    <w:lvlOverride w:ilvl="3">
+      <w:startOverride w:val="1"/>
+    </w:lvlOverride>
+    <w:lvlOverride w:ilvl="4">
+      <w:startOverride w:val="1"/>
+    </w:lvlOverride>
+    <w:lvlOverride w:ilvl="5">
+      <w:startOverride w:val="1"/>
+    </w:lvlOverride>
+    <w:lvlOverride w:ilvl="6">
+      <w:startOverride w:val="1"/>
+    </w:lvlOverride>
+    <w:lvlOverride w:ilvl="7">
+      <w:startOverride w:val="1"/>
+    </w:lvlOverride>
+    <w:lvlOverride w:ilvl="8">
+      <w:startOverride w:val="1"/>
+    </w:lvlOverride>
+  </w:num>
+  <w:num w:numId="1012">
     <w:abstractNumId w:val="99411"/>
     <w:lvlOverride w:ilvl="0">
       <w:startOverride w:val="1"/>

</xml_diff>